<commit_message>
Deck and docs: speaker script and notes removed from the repository and from the public deck (notes are rehearsal material kept locally, git-ignored); README/explainer references updated
Co-Authored-By: Claude Fable 5.1 <noreply@anthropic.com>
Claude-Session: https://claude.ai/code/session_01Xf5A9DfRgzoaeNELy2iEQH
</commit_message>
<xml_diff>
--- a/docs/Daromad_project_explained.docx
+++ b/docs/Daromad_project_explained.docx
@@ -104,7 +104,7 @@
         </w:rPr>
         <w:t xml:space="preserve">Live prototype: </w:t>
       </w:r>
-      <w:hyperlink w:history="1" r:id="rIdabx4nnvrar-pgthvmnkxv">
+      <w:hyperlink w:history="1" r:id="rIdgdkhkblhu7q-pjopek41q">
         <w:r>
           <w:rPr>
             <w:rFonts w:ascii="Calibri" w:cs="Calibri" w:eastAsia="Calibri" w:hAnsi="Calibri"/>
@@ -131,7 +131,7 @@
         </w:rPr>
         <w:t xml:space="preserve">Source code: </w:t>
       </w:r>
-      <w:hyperlink w:history="1" r:id="rId8acrdg8fm66lde_2dq_ny">
+      <w:hyperlink w:history="1" r:id="rIdt899_mjvlyg8rjmmbq-hf">
         <w:r>
           <w:rPr>
             <w:rFonts w:ascii="Calibri" w:cs="Calibri" w:eastAsia="Calibri" w:hAnsi="Calibri"/>
@@ -642,7 +642,7 @@
           <w:sz w:val="22"/>
           <w:szCs w:val="22"/>
         </w:rPr>
-        <w:t xml:space="preserve">README (how to run, deploy and reproduce everything), ARCHITECTURE, DATA_SOURCES with licences, MODEL_CARD, DECK_SCRIPT (the 7-minute script with timings and Q&amp;A one-liners), REGULATION_QUOTES, an MIT licence and a GitHub Actions workflow that runs the tests and the build on every push.</w:t>
+        <w:t xml:space="preserve">README (how to run, deploy and reproduce everything), ARCHITECTURE, DATA_SOURCES with licences, MODEL_CARD, REGULATION_QUOTES, an MIT licence and a GitHub Actions workflow that runs the tests and the build on every push.</w:t>
       </w:r>
     </w:p>
     <w:p>
@@ -670,7 +670,7 @@
           <w:sz w:val="22"/>
           <w:szCs w:val="22"/>
         </w:rPr>
-        <w:t xml:space="preserve">Ten slides plus three appendix slides, with speaker notes and timings, generated from code so that every number on the slides is read from the same JSON files as the website. Exported as PPTX and PDF, with QR codes to the live site and the repository.</w:t>
+        <w:t xml:space="preserve">Ten slides plus three appendix slides, generated from code so that every number on the slides is read from the same JSON files as the website. Exported as PPTX and PDF, with QR codes to the live site and the repository.</w:t>
       </w:r>
     </w:p>
     <w:p>
@@ -3375,7 +3375,7 @@
         </w:rPr>
         <w:t xml:space="preserve">Live prototype: </w:t>
       </w:r>
-      <w:hyperlink w:history="1" r:id="rIdjskqb98ck9hdzio12hv-y">
+      <w:hyperlink w:history="1" r:id="rId5yyrgj916kgt5dw9ugicw">
         <w:r>
           <w:rPr>
             <w:rFonts w:ascii="Calibri" w:cs="Calibri" w:eastAsia="Calibri" w:hAnsi="Calibri"/>
@@ -3415,7 +3415,7 @@
         </w:rPr>
         <w:t xml:space="preserve">Repository: </w:t>
       </w:r>
-      <w:hyperlink w:history="1" r:id="rIdmlwlntfbjglvkif9ik6iw">
+      <w:hyperlink w:history="1" r:id="rIdsaqfe1xoq0snt0xvhggsr">
         <w:r>
           <w:rPr>
             <w:rFonts w:ascii="Calibri" w:cs="Calibri" w:eastAsia="Calibri" w:hAnsi="Calibri"/>
@@ -3455,7 +3455,7 @@
         </w:rPr>
         <w:t xml:space="preserve">Model card page: </w:t>
       </w:r>
-      <w:hyperlink w:history="1" r:id="rIdyzj82czc-etk6sgeazjjd">
+      <w:hyperlink w:history="1" r:id="rIdkovqfqplsgo9lesyxgccl">
         <w:r>
           <w:rPr>
             <w:rFonts w:ascii="Calibri" w:cs="Calibri" w:eastAsia="Calibri" w:hAnsi="Calibri"/>
@@ -3501,7 +3501,7 @@
           <w:sz w:val="22"/>
           <w:szCs w:val="22"/>
         </w:rPr>
-        <w:t xml:space="preserve">deck/Daromad_TYS_deck.pptx and .pdf; speaker script with timings in docs/DECK_SCRIPT.md.</w:t>
+        <w:t xml:space="preserve">deck/Daromad_TYS_deck.pptx and .pdf (10 slides + 3 appendix slides), generated by deck/build_deck.js from the same JSON files as the website.</w:t>
       </w:r>
     </w:p>
     <w:p>
@@ -4710,192 +4710,6 @@
       <w:pPr>
         <w:spacing w:after="120"/>
       </w:pPr>
-    </w:p>
-    <w:p>
-      <w:pPr>
-        <w:pStyle w:val="Heading2"/>
-        <w:keepNext/>
-        <w:spacing w:after="100" w:before="260"/>
-      </w:pPr>
-      <w:r>
-        <w:rPr>
-          <w:rFonts w:ascii="Cambria" w:cs="Cambria" w:eastAsia="Cambria" w:hAnsi="Cambria"/>
-          <w:b/>
-          <w:bCs/>
-          <w:color w:val="1F4E3D"/>
-          <w:sz w:val="26"/>
-          <w:szCs w:val="26"/>
-        </w:rPr>
-        <w:t xml:space="preserve">13. Six quick answers for the Q&amp;A</w:t>
-      </w:r>
-    </w:p>
-    <w:p>
-      <w:pPr>
-        <w:pStyle w:val="ListParagraph"/>
-        <w:numPr>
-          <w:ilvl w:val="0"/>
-          <w:numId w:val="3"/>
-        </w:numPr>
-        <w:spacing w:after="80" w:line="290"/>
-      </w:pPr>
-      <w:r>
-        <w:rPr>
-          <w:rFonts w:ascii="Calibri" w:cs="Calibri" w:eastAsia="Calibri" w:hAnsi="Calibri"/>
-          <w:b/>
-          <w:bCs/>
-          <w:sz w:val="22"/>
-          <w:szCs w:val="22"/>
-        </w:rPr>
-        <w:t xml:space="preserve">Is it just an LLM reading PDFs? </w:t>
-      </w:r>
-      <w:r>
-        <w:rPr>
-          <w:rFonts w:ascii="Calibri" w:cs="Calibri" w:eastAsia="Calibri" w:hAnsi="Calibri"/>
-          <w:sz w:val="22"/>
-          <w:szCs w:val="22"/>
-        </w:rPr>
-        <w:t xml:space="preserve">No — there is no LLM in the product. Seven deterministic components; the only generative step is a template with a verifier.</w:t>
-      </w:r>
-    </w:p>
-    <w:p>
-      <w:pPr>
-        <w:pStyle w:val="ListParagraph"/>
-        <w:numPr>
-          <w:ilvl w:val="0"/>
-          <w:numId w:val="3"/>
-        </w:numPr>
-        <w:spacing w:after="80" w:line="290"/>
-      </w:pPr>
-      <w:r>
-        <w:rPr>
-          <w:rFonts w:ascii="Calibri" w:cs="Calibri" w:eastAsia="Calibri" w:hAnsi="Calibri"/>
-          <w:b/>
-          <w:bCs/>
-          <w:sz w:val="22"/>
-          <w:szCs w:val="22"/>
-        </w:rPr>
-        <w:t xml:space="preserve">Trained on synthetic data? </w:t>
-      </w:r>
-      <w:r>
-        <w:rPr>
-          <w:rFonts w:ascii="Calibri" w:cs="Calibri" w:eastAsia="Calibri" w:hAnsi="Calibri"/>
-          <w:sz w:val="22"/>
-          <w:szCs w:val="22"/>
-        </w:rPr>
-        <w:t xml:space="preserve">Yes, declared. The synthetic AUC proves the pipeline; the Berka result shows the method carries signal on real data; the pilot retrains inside the bank.</w:t>
-      </w:r>
-    </w:p>
-    <w:p>
-      <w:pPr>
-        <w:pStyle w:val="ListParagraph"/>
-        <w:numPr>
-          <w:ilvl w:val="0"/>
-          <w:numId w:val="3"/>
-        </w:numPr>
-        <w:spacing w:after="80" w:line="290"/>
-      </w:pPr>
-      <w:r>
-        <w:rPr>
-          <w:rFonts w:ascii="Calibri" w:cs="Calibri" w:eastAsia="Calibri" w:hAnsi="Calibri"/>
-          <w:b/>
-          <w:bCs/>
-          <w:sz w:val="22"/>
-          <w:szCs w:val="22"/>
-        </w:rPr>
-        <w:t xml:space="preserve">Why not the credit bureau? </w:t>
-      </w:r>
-      <w:r>
-        <w:rPr>
-          <w:rFonts w:ascii="Calibri" w:cs="Calibri" w:eastAsia="Calibri" w:hAnsi="Calibri"/>
-          <w:sz w:val="22"/>
-          <w:szCs w:val="22"/>
-        </w:rPr>
-        <w:t xml:space="preserve">Thin-file borrowers have no bureau record. Where one exists it is an input — the obligations table.</w:t>
-      </w:r>
-    </w:p>
-    <w:p>
-      <w:pPr>
-        <w:pStyle w:val="ListParagraph"/>
-        <w:numPr>
-          <w:ilvl w:val="0"/>
-          <w:numId w:val="3"/>
-        </w:numPr>
-        <w:spacing w:after="80" w:line="290"/>
-      </w:pPr>
-      <w:r>
-        <w:rPr>
-          <w:rFonts w:ascii="Calibri" w:cs="Calibri" w:eastAsia="Calibri" w:hAnsi="Calibri"/>
-          <w:b/>
-          <w:bCs/>
-          <w:sz w:val="22"/>
-          <w:szCs w:val="22"/>
-        </w:rPr>
-        <w:t xml:space="preserve">What about forged statements? </w:t>
-      </w:r>
-      <w:r>
-        <w:rPr>
-          <w:rFonts w:ascii="Calibri" w:cs="Calibri" w:eastAsia="Calibri" w:hAnsi="Calibri"/>
-          <w:sz w:val="22"/>
-          <w:szCs w:val="22"/>
-        </w:rPr>
-        <w:t xml:space="preserve">Balance chain, duplicates, round-sum spikes, circular transfers, holder match, direction safety net — and in production MKBANK's own account data comes from the core system, not an upload.</w:t>
-      </w:r>
-    </w:p>
-    <w:p>
-      <w:pPr>
-        <w:pStyle w:val="ListParagraph"/>
-        <w:numPr>
-          <w:ilvl w:val="0"/>
-          <w:numId w:val="3"/>
-        </w:numPr>
-        <w:spacing w:after="80" w:line="290"/>
-      </w:pPr>
-      <w:r>
-        <w:rPr>
-          <w:rFonts w:ascii="Calibri" w:cs="Calibri" w:eastAsia="Calibri" w:hAnsi="Calibri"/>
-          <w:b/>
-          <w:bCs/>
-          <w:sz w:val="22"/>
-          <w:szCs w:val="22"/>
-        </w:rPr>
-        <w:t xml:space="preserve">Where does the customer's data go? </w:t>
-      </w:r>
-      <w:r>
-        <w:rPr>
-          <w:rFonts w:ascii="Calibri" w:cs="Calibri" w:eastAsia="Calibri" w:hAnsi="Calibri"/>
-          <w:sz w:val="22"/>
-          <w:szCs w:val="22"/>
-        </w:rPr>
-        <w:t xml:space="preserve">Nowhere. Nothing leaves the browser in the prototype; nothing leaves the bank in production.</w:t>
-      </w:r>
-    </w:p>
-    <w:p>
-      <w:pPr>
-        <w:pStyle w:val="ListParagraph"/>
-        <w:numPr>
-          <w:ilvl w:val="0"/>
-          <w:numId w:val="3"/>
-        </w:numPr>
-        <w:spacing w:after="80" w:line="290"/>
-      </w:pPr>
-      <w:r>
-        <w:rPr>
-          <w:rFonts w:ascii="Calibri" w:cs="Calibri" w:eastAsia="Calibri" w:hAnsi="Calibri"/>
-          <w:b/>
-          <w:bCs/>
-          <w:sz w:val="22"/>
-          <w:szCs w:val="22"/>
-        </w:rPr>
-        <w:t xml:space="preserve">The 50-BRV exclusion? </w:t>
-      </w:r>
-      <w:r>
-        <w:rPr>
-          <w:rFonts w:ascii="Calibri" w:cs="Calibri" w:eastAsia="Calibri" w:hAnsi="Calibri"/>
-          <w:sz w:val="22"/>
-          <w:szCs w:val="22"/>
-        </w:rPr>
-        <w:t xml:space="preserve">Written for microfinance organisations and pawnshops. A bank only has the 15 % portfolio quota. Daromad defaults to bank, computes the ratio for every application and shows the quota as a note.</w:t>
-      </w:r>
     </w:p>
     <w:sectPr>
       <w:headerReference w:type="default" r:id="rId7"/>

</xml_diff>

<commit_message>
Team member names removed from the deck, README, About page and explainer (roles kept, team name only)
Co-Authored-By: Claude Fable 5.1 <noreply@anthropic.com>
Claude-Session: https://claude.ai/code/session_01Xf5A9DfRgzoaeNELy2iEQH
</commit_message>
<xml_diff>
--- a/docs/Daromad_project_explained.docx
+++ b/docs/Daromad_project_explained.docx
@@ -69,7 +69,7 @@
           <w:sz w:val="22"/>
           <w:szCs w:val="22"/>
         </w:rPr>
-        <w:t xml:space="preserve"> — Munisbek (technical lead), Jahongir (research and data), Umida (compliance and business case)</w:t>
+        <w:t xml:space="preserve"> — three members: technical lead, research and data, compliance and business case</w:t>
       </w:r>
     </w:p>
     <w:p>
@@ -104,7 +104,7 @@
         </w:rPr>
         <w:t xml:space="preserve">Live prototype: </w:t>
       </w:r>
-      <w:hyperlink w:history="1" r:id="rIdgdkhkblhu7q-pjopek41q">
+      <w:hyperlink w:history="1" r:id="rIdjwk7y4acuuaolhmipw4a-">
         <w:r>
           <w:rPr>
             <w:rFonts w:ascii="Calibri" w:cs="Calibri" w:eastAsia="Calibri" w:hAnsi="Calibri"/>
@@ -131,7 +131,7 @@
         </w:rPr>
         <w:t xml:space="preserve">Source code: </w:t>
       </w:r>
-      <w:hyperlink w:history="1" r:id="rIdt899_mjvlyg8rjmmbq-hf">
+      <w:hyperlink w:history="1" r:id="rId-cxuywvqadv0wimfmjvsy">
         <w:r>
           <w:rPr>
             <w:rFonts w:ascii="Calibri" w:cs="Calibri" w:eastAsia="Calibri" w:hAnsi="Calibri"/>
@@ -2908,9 +2908,8 @@
         </w:tblBorders>
       </w:tblPr>
       <w:tblGrid>
-        <w:gridCol w:w="1800"/>
-        <w:gridCol w:w="2200"/>
-        <w:gridCol w:w="5026"/>
+        <w:gridCol w:w="2600"/>
+        <w:gridCol w:w="6426"/>
       </w:tblGrid>
       <w:tr>
         <w:trPr>
@@ -2919,7 +2918,7 @@
         </w:trPr>
         <w:tc>
           <w:tcPr>
-            <w:tcW w:type="dxa" w:w="1800"/>
+            <w:tcW w:type="dxa" w:w="2600"/>
             <w:tcBorders>
               <w:top w:val="single" w:color="C9D6CF" w:sz="4"/>
               <w:left w:val="none" w:color="FFFFFF" w:sz="0"/>
@@ -2947,47 +2946,13 @@
                 <w:sz w:val="20"/>
                 <w:szCs w:val="20"/>
               </w:rPr>
-              <w:t xml:space="preserve">Team member</w:t>
-            </w:r>
-          </w:p>
-        </w:tc>
-        <w:tc>
-          <w:tcPr>
-            <w:tcW w:type="dxa" w:w="2200"/>
-            <w:tcBorders>
-              <w:top w:val="single" w:color="C9D6CF" w:sz="4"/>
-              <w:left w:val="none" w:color="FFFFFF" w:sz="0"/>
-              <w:bottom w:val="single" w:color="C9D6CF" w:sz="4"/>
-              <w:right w:val="none" w:color="FFFFFF" w:sz="0"/>
-            </w:tcBorders>
-            <w:shd w:fill="1F4E3D" w:color="auto" w:val="clear"/>
-            <w:tcMar>
-              <w:top w:type="dxa" w:w="70"/>
-              <w:left w:type="dxa" w:w="100"/>
-              <w:bottom w:type="dxa" w:w="70"/>
-              <w:right w:type="dxa" w:w="100"/>
-            </w:tcMar>
-          </w:tcPr>
-          <w:p>
-            <w:pPr>
-              <w:spacing w:after="0" w:line="260"/>
-            </w:pPr>
-            <w:r>
-              <w:rPr>
-                <w:rFonts w:ascii="Calibri" w:cs="Calibri" w:eastAsia="Calibri" w:hAnsi="Calibri"/>
-                <w:b/>
-                <w:bCs/>
-                <w:color w:val="FFFFFF"/>
-                <w:sz w:val="20"/>
-                <w:szCs w:val="20"/>
-              </w:rPr>
               <w:t xml:space="preserve">Role</w:t>
             </w:r>
           </w:p>
         </w:tc>
         <w:tc>
           <w:tcPr>
-            <w:tcW w:type="dxa" w:w="5026"/>
+            <w:tcW w:type="dxa" w:w="6426"/>
             <w:tcBorders>
               <w:top w:val="single" w:color="C9D6CF" w:sz="4"/>
               <w:left w:val="none" w:color="FFFFFF" w:sz="0"/>
@@ -3026,40 +2991,7 @@
         </w:trPr>
         <w:tc>
           <w:tcPr>
-            <w:tcW w:type="dxa" w:w="1800"/>
-            <w:tcBorders>
-              <w:top w:val="single" w:color="C9D6CF" w:sz="4"/>
-              <w:left w:val="none" w:color="FFFFFF" w:sz="0"/>
-              <w:bottom w:val="single" w:color="C9D6CF" w:sz="4"/>
-              <w:right w:val="none" w:color="FFFFFF" w:sz="0"/>
-            </w:tcBorders>
-            <w:tcMar>
-              <w:top w:type="dxa" w:w="70"/>
-              <w:left w:type="dxa" w:w="100"/>
-              <w:bottom w:type="dxa" w:w="70"/>
-              <w:right w:type="dxa" w:w="100"/>
-            </w:tcMar>
-          </w:tcPr>
-          <w:p>
-            <w:pPr>
-              <w:spacing w:after="0" w:line="260"/>
-            </w:pPr>
-            <w:r>
-              <w:rPr>
-                <w:rFonts w:ascii="Calibri" w:cs="Calibri" w:eastAsia="Calibri" w:hAnsi="Calibri"/>
-                <w:b w:val="false"/>
-                <w:bCs w:val="false"/>
-                <w:color w:val="000000"/>
-                <w:sz w:val="20"/>
-                <w:szCs w:val="20"/>
-              </w:rPr>
-              <w:t xml:space="preserve">Munisbek</w:t>
-            </w:r>
-          </w:p>
-        </w:tc>
-        <w:tc>
-          <w:tcPr>
-            <w:tcW w:type="dxa" w:w="2200"/>
+            <w:tcW w:type="dxa" w:w="2600"/>
             <w:tcBorders>
               <w:top w:val="single" w:color="C9D6CF" w:sz="4"/>
               <w:left w:val="none" w:color="FFFFFF" w:sz="0"/>
@@ -3092,7 +3024,7 @@
         </w:tc>
         <w:tc>
           <w:tcPr>
-            <w:tcW w:type="dxa" w:w="5026"/>
+            <w:tcW w:type="dxa" w:w="6426"/>
             <w:tcBorders>
               <w:top w:val="single" w:color="C9D6CF" w:sz="4"/>
               <w:left w:val="none" w:color="FFFFFF" w:sz="0"/>
@@ -3130,40 +3062,7 @@
         </w:trPr>
         <w:tc>
           <w:tcPr>
-            <w:tcW w:type="dxa" w:w="1800"/>
-            <w:tcBorders>
-              <w:top w:val="single" w:color="C9D6CF" w:sz="4"/>
-              <w:left w:val="none" w:color="FFFFFF" w:sz="0"/>
-              <w:bottom w:val="single" w:color="C9D6CF" w:sz="4"/>
-              <w:right w:val="none" w:color="FFFFFF" w:sz="0"/>
-            </w:tcBorders>
-            <w:tcMar>
-              <w:top w:type="dxa" w:w="70"/>
-              <w:left w:type="dxa" w:w="100"/>
-              <w:bottom w:type="dxa" w:w="70"/>
-              <w:right w:type="dxa" w:w="100"/>
-            </w:tcMar>
-          </w:tcPr>
-          <w:p>
-            <w:pPr>
-              <w:spacing w:after="0" w:line="260"/>
-            </w:pPr>
-            <w:r>
-              <w:rPr>
-                <w:rFonts w:ascii="Calibri" w:cs="Calibri" w:eastAsia="Calibri" w:hAnsi="Calibri"/>
-                <w:b w:val="false"/>
-                <w:bCs w:val="false"/>
-                <w:color w:val="000000"/>
-                <w:sz w:val="20"/>
-                <w:szCs w:val="20"/>
-              </w:rPr>
-              <w:t xml:space="preserve">Jahongir</w:t>
-            </w:r>
-          </w:p>
-        </w:tc>
-        <w:tc>
-          <w:tcPr>
-            <w:tcW w:type="dxa" w:w="2200"/>
+            <w:tcW w:type="dxa" w:w="2600"/>
             <w:tcBorders>
               <w:top w:val="single" w:color="C9D6CF" w:sz="4"/>
               <w:left w:val="none" w:color="FFFFFF" w:sz="0"/>
@@ -3196,7 +3095,7 @@
         </w:tc>
         <w:tc>
           <w:tcPr>
-            <w:tcW w:type="dxa" w:w="5026"/>
+            <w:tcW w:type="dxa" w:w="6426"/>
             <w:tcBorders>
               <w:top w:val="single" w:color="C9D6CF" w:sz="4"/>
               <w:left w:val="none" w:color="FFFFFF" w:sz="0"/>
@@ -3234,40 +3133,7 @@
         </w:trPr>
         <w:tc>
           <w:tcPr>
-            <w:tcW w:type="dxa" w:w="1800"/>
-            <w:tcBorders>
-              <w:top w:val="single" w:color="C9D6CF" w:sz="4"/>
-              <w:left w:val="none" w:color="FFFFFF" w:sz="0"/>
-              <w:bottom w:val="single" w:color="C9D6CF" w:sz="4"/>
-              <w:right w:val="none" w:color="FFFFFF" w:sz="0"/>
-            </w:tcBorders>
-            <w:tcMar>
-              <w:top w:type="dxa" w:w="70"/>
-              <w:left w:type="dxa" w:w="100"/>
-              <w:bottom w:type="dxa" w:w="70"/>
-              <w:right w:type="dxa" w:w="100"/>
-            </w:tcMar>
-          </w:tcPr>
-          <w:p>
-            <w:pPr>
-              <w:spacing w:after="0" w:line="260"/>
-            </w:pPr>
-            <w:r>
-              <w:rPr>
-                <w:rFonts w:ascii="Calibri" w:cs="Calibri" w:eastAsia="Calibri" w:hAnsi="Calibri"/>
-                <w:b w:val="false"/>
-                <w:bCs w:val="false"/>
-                <w:color w:val="000000"/>
-                <w:sz w:val="20"/>
-                <w:szCs w:val="20"/>
-              </w:rPr>
-              <w:t xml:space="preserve">Umida</w:t>
-            </w:r>
-          </w:p>
-        </w:tc>
-        <w:tc>
-          <w:tcPr>
-            <w:tcW w:type="dxa" w:w="2200"/>
+            <w:tcW w:type="dxa" w:w="2600"/>
             <w:tcBorders>
               <w:top w:val="single" w:color="C9D6CF" w:sz="4"/>
               <w:left w:val="none" w:color="FFFFFF" w:sz="0"/>
@@ -3300,34 +3166,34 @@
         </w:tc>
         <w:tc>
           <w:tcPr>
-            <w:tcW w:type="dxa" w:w="5026"/>
-            <w:tcBorders>
-              <w:top w:val="single" w:color="C9D6CF" w:sz="4"/>
-              <w:left w:val="none" w:color="FFFFFF" w:sz="0"/>
-              <w:bottom w:val="single" w:color="C9D6CF" w:sz="4"/>
-              <w:right w:val="none" w:color="FFFFFF" w:sz="0"/>
-            </w:tcBorders>
-            <w:tcMar>
-              <w:top w:type="dxa" w:w="70"/>
-              <w:left w:type="dxa" w:w="100"/>
-              <w:bottom w:type="dxa" w:w="70"/>
-              <w:right w:type="dxa" w:w="100"/>
-            </w:tcMar>
-          </w:tcPr>
-          <w:p>
-            <w:pPr>
-              <w:spacing w:after="0" w:line="260"/>
-            </w:pPr>
-            <w:r>
-              <w:rPr>
-                <w:rFonts w:ascii="Calibri" w:cs="Calibri" w:eastAsia="Calibri" w:hAnsi="Calibri"/>
-                <w:b w:val="false"/>
-                <w:bCs w:val="false"/>
-                <w:color w:val="000000"/>
-                <w:sz w:val="20"/>
-                <w:szCs w:val="20"/>
-              </w:rPr>
-              <w:t xml:space="preserve">ПДН rules and exemptions, data-protection design, pilot budget and ROI, defence deck and script</w:t>
+            <w:tcW w:type="dxa" w:w="6426"/>
+            <w:tcBorders>
+              <w:top w:val="single" w:color="C9D6CF" w:sz="4"/>
+              <w:left w:val="none" w:color="FFFFFF" w:sz="0"/>
+              <w:bottom w:val="single" w:color="C9D6CF" w:sz="4"/>
+              <w:right w:val="none" w:color="FFFFFF" w:sz="0"/>
+            </w:tcBorders>
+            <w:tcMar>
+              <w:top w:type="dxa" w:w="70"/>
+              <w:left w:type="dxa" w:w="100"/>
+              <w:bottom w:type="dxa" w:w="70"/>
+              <w:right w:type="dxa" w:w="100"/>
+            </w:tcMar>
+          </w:tcPr>
+          <w:p>
+            <w:pPr>
+              <w:spacing w:after="0" w:line="260"/>
+            </w:pPr>
+            <w:r>
+              <w:rPr>
+                <w:rFonts w:ascii="Calibri" w:cs="Calibri" w:eastAsia="Calibri" w:hAnsi="Calibri"/>
+                <w:b w:val="false"/>
+                <w:bCs w:val="false"/>
+                <w:color w:val="000000"/>
+                <w:sz w:val="20"/>
+                <w:szCs w:val="20"/>
+              </w:rPr>
+              <w:t xml:space="preserve">ПДН rules and exemptions, data-protection design, pilot budget and ROI, defence deck</w:t>
             </w:r>
           </w:p>
         </w:tc>
@@ -3375,7 +3241,7 @@
         </w:rPr>
         <w:t xml:space="preserve">Live prototype: </w:t>
       </w:r>
-      <w:hyperlink w:history="1" r:id="rId5yyrgj916kgt5dw9ugicw">
+      <w:hyperlink w:history="1" r:id="rIdscq-krg6e-kq0dxvvoycf">
         <w:r>
           <w:rPr>
             <w:rFonts w:ascii="Calibri" w:cs="Calibri" w:eastAsia="Calibri" w:hAnsi="Calibri"/>
@@ -3415,7 +3281,7 @@
         </w:rPr>
         <w:t xml:space="preserve">Repository: </w:t>
       </w:r>
-      <w:hyperlink w:history="1" r:id="rIdsaqfe1xoq0snt0xvhggsr">
+      <w:hyperlink w:history="1" r:id="rIdqtghaigblq5nk_irirjnm">
         <w:r>
           <w:rPr>
             <w:rFonts w:ascii="Calibri" w:cs="Calibri" w:eastAsia="Calibri" w:hAnsi="Calibri"/>
@@ -3455,7 +3321,7 @@
         </w:rPr>
         <w:t xml:space="preserve">Model card page: </w:t>
       </w:r>
-      <w:hyperlink w:history="1" r:id="rIdkovqfqplsgo9lesyxgccl">
+      <w:hyperlink w:history="1" r:id="rIdc0h15o94wrownkimljamd">
         <w:r>
           <w:rPr>
             <w:rFonts w:ascii="Calibri" w:cs="Calibri" w:eastAsia="Calibri" w:hAnsi="Calibri"/>

</xml_diff>

<commit_message>
Roles removed everywhere; title slide shows the team name, mode and partners only (product introduced later in the deck)
Co-Authored-By: Claude Fable 5.1 <noreply@anthropic.com>
Claude-Session: https://claude.ai/code/session_01Xf5A9DfRgzoaeNELy2iEQH
</commit_message>
<xml_diff>
--- a/docs/Daromad_project_explained.docx
+++ b/docs/Daromad_project_explained.docx
@@ -63,14 +63,6 @@
         </w:rPr>
         <w:t xml:space="preserve">Team TYS</w:t>
       </w:r>
-      <w:r>
-        <w:rPr>
-          <w:rFonts w:ascii="Calibri" w:cs="Calibri" w:eastAsia="Calibri" w:hAnsi="Calibri"/>
-          <w:sz w:val="22"/>
-          <w:szCs w:val="22"/>
-        </w:rPr>
-        <w:t xml:space="preserve"> — three members: technical lead, research and data, compliance and business case</w:t>
-      </w:r>
     </w:p>
     <w:p>
       <w:pPr>
@@ -104,7 +96,7 @@
         </w:rPr>
         <w:t xml:space="preserve">Live prototype: </w:t>
       </w:r>
-      <w:hyperlink w:history="1" r:id="rIdjwk7y4acuuaolhmipw4a-">
+      <w:hyperlink w:history="1" r:id="rIdmtxz-u7olnra-vmwhix9o">
         <w:r>
           <w:rPr>
             <w:rFonts w:ascii="Calibri" w:cs="Calibri" w:eastAsia="Calibri" w:hAnsi="Calibri"/>
@@ -131,7 +123,7 @@
         </w:rPr>
         <w:t xml:space="preserve">Source code: </w:t>
       </w:r>
-      <w:hyperlink w:history="1" r:id="rId-cxuywvqadv0wimfmjvsy">
+      <w:hyperlink w:history="1" r:id="rIdc2culx-a4ariizsqtno1s">
         <w:r>
           <w:rPr>
             <w:rFonts w:ascii="Calibri" w:cs="Calibri" w:eastAsia="Calibri" w:hAnsi="Calibri"/>
@@ -220,7 +212,7 @@
           <w:sz w:val="22"/>
           <w:szCs w:val="22"/>
         </w:rPr>
-        <w:t xml:space="preserve">Part A explains the problem and the idea. Part B lists, step by step, what we did during the final. Part C explains how the system works, screen by screen and then under the hood. Part D gives the measured results, the business case and the honest limits. Part E has the team, the links and a glossary of the technical words.</w:t>
+        <w:t xml:space="preserve">Part A explains the problem and the idea. Part B lists, step by step, what we did during the final. Part C explains how the system works, screen by screen and then under the hood. Part D gives the measured results, the business case and the honest limits. Part E has the links and a glossary of the technical words.</w:t>
       </w:r>
     </w:p>
     <w:p>
@@ -2874,7 +2866,7 @@
           <w:sz w:val="32"/>
           <w:szCs w:val="32"/>
         </w:rPr>
-        <w:t xml:space="preserve">Part E — Team, links and glossary</w:t>
+        <w:t xml:space="preserve">Part E — Links and glossary</w:t>
       </w:r>
     </w:p>
     <w:p>
@@ -2892,334 +2884,7 @@
           <w:sz w:val="26"/>
           <w:szCs w:val="26"/>
         </w:rPr>
-        <w:t xml:space="preserve">10. Who did what</w:t>
-      </w:r>
-    </w:p>
-    <w:tbl>
-      <w:tblPr>
-        <w:tblW w:type="dxa" w:w="9026"/>
-        <w:tblBorders>
-          <w:top w:val="single" w:color="auto" w:sz="4"/>
-          <w:left w:val="single" w:color="auto" w:sz="4"/>
-          <w:bottom w:val="single" w:color="auto" w:sz="4"/>
-          <w:right w:val="single" w:color="auto" w:sz="4"/>
-          <w:insideH w:val="single" w:color="auto" w:sz="4"/>
-          <w:insideV w:val="single" w:color="auto" w:sz="4"/>
-        </w:tblBorders>
-      </w:tblPr>
-      <w:tblGrid>
-        <w:gridCol w:w="2600"/>
-        <w:gridCol w:w="6426"/>
-      </w:tblGrid>
-      <w:tr>
-        <w:trPr>
-          <w:cantSplit/>
-          <w:tblHeader/>
-        </w:trPr>
-        <w:tc>
-          <w:tcPr>
-            <w:tcW w:type="dxa" w:w="2600"/>
-            <w:tcBorders>
-              <w:top w:val="single" w:color="C9D6CF" w:sz="4"/>
-              <w:left w:val="none" w:color="FFFFFF" w:sz="0"/>
-              <w:bottom w:val="single" w:color="C9D6CF" w:sz="4"/>
-              <w:right w:val="none" w:color="FFFFFF" w:sz="0"/>
-            </w:tcBorders>
-            <w:shd w:fill="1F4E3D" w:color="auto" w:val="clear"/>
-            <w:tcMar>
-              <w:top w:type="dxa" w:w="70"/>
-              <w:left w:type="dxa" w:w="100"/>
-              <w:bottom w:type="dxa" w:w="70"/>
-              <w:right w:type="dxa" w:w="100"/>
-            </w:tcMar>
-          </w:tcPr>
-          <w:p>
-            <w:pPr>
-              <w:spacing w:after="0" w:line="260"/>
-            </w:pPr>
-            <w:r>
-              <w:rPr>
-                <w:rFonts w:ascii="Calibri" w:cs="Calibri" w:eastAsia="Calibri" w:hAnsi="Calibri"/>
-                <w:b/>
-                <w:bCs/>
-                <w:color w:val="FFFFFF"/>
-                <w:sz w:val="20"/>
-                <w:szCs w:val="20"/>
-              </w:rPr>
-              <w:t xml:space="preserve">Role</w:t>
-            </w:r>
-          </w:p>
-        </w:tc>
-        <w:tc>
-          <w:tcPr>
-            <w:tcW w:type="dxa" w:w="6426"/>
-            <w:tcBorders>
-              <w:top w:val="single" w:color="C9D6CF" w:sz="4"/>
-              <w:left w:val="none" w:color="FFFFFF" w:sz="0"/>
-              <w:bottom w:val="single" w:color="C9D6CF" w:sz="4"/>
-              <w:right w:val="none" w:color="FFFFFF" w:sz="0"/>
-            </w:tcBorders>
-            <w:shd w:fill="1F4E3D" w:color="auto" w:val="clear"/>
-            <w:tcMar>
-              <w:top w:type="dxa" w:w="70"/>
-              <w:left w:type="dxa" w:w="100"/>
-              <w:bottom w:type="dxa" w:w="70"/>
-              <w:right w:type="dxa" w:w="100"/>
-            </w:tcMar>
-          </w:tcPr>
-          <w:p>
-            <w:pPr>
-              <w:spacing w:after="0" w:line="260"/>
-            </w:pPr>
-            <w:r>
-              <w:rPr>
-                <w:rFonts w:ascii="Calibri" w:cs="Calibri" w:eastAsia="Calibri" w:hAnsi="Calibri"/>
-                <w:b/>
-                <w:bCs/>
-                <w:color w:val="FFFFFF"/>
-                <w:sz w:val="20"/>
-                <w:szCs w:val="20"/>
-              </w:rPr>
-              <w:t xml:space="preserve">Responsible for</w:t>
-            </w:r>
-          </w:p>
-        </w:tc>
-      </w:tr>
-      <w:tr>
-        <w:trPr>
-          <w:cantSplit/>
-        </w:trPr>
-        <w:tc>
-          <w:tcPr>
-            <w:tcW w:type="dxa" w:w="2600"/>
-            <w:tcBorders>
-              <w:top w:val="single" w:color="C9D6CF" w:sz="4"/>
-              <w:left w:val="none" w:color="FFFFFF" w:sz="0"/>
-              <w:bottom w:val="single" w:color="C9D6CF" w:sz="4"/>
-              <w:right w:val="none" w:color="FFFFFF" w:sz="0"/>
-            </w:tcBorders>
-            <w:tcMar>
-              <w:top w:type="dxa" w:w="70"/>
-              <w:left w:type="dxa" w:w="100"/>
-              <w:bottom w:type="dxa" w:w="70"/>
-              <w:right w:type="dxa" w:w="100"/>
-            </w:tcMar>
-          </w:tcPr>
-          <w:p>
-            <w:pPr>
-              <w:spacing w:after="0" w:line="260"/>
-            </w:pPr>
-            <w:r>
-              <w:rPr>
-                <w:rFonts w:ascii="Calibri" w:cs="Calibri" w:eastAsia="Calibri" w:hAnsi="Calibri"/>
-                <w:b w:val="false"/>
-                <w:bCs w:val="false"/>
-                <w:color w:val="000000"/>
-                <w:sz w:val="20"/>
-                <w:szCs w:val="20"/>
-              </w:rPr>
-              <w:t xml:space="preserve">Technical lead</w:t>
-            </w:r>
-          </w:p>
-        </w:tc>
-        <w:tc>
-          <w:tcPr>
-            <w:tcW w:type="dxa" w:w="6426"/>
-            <w:tcBorders>
-              <w:top w:val="single" w:color="C9D6CF" w:sz="4"/>
-              <w:left w:val="none" w:color="FFFFFF" w:sz="0"/>
-              <w:bottom w:val="single" w:color="C9D6CF" w:sz="4"/>
-              <w:right w:val="none" w:color="FFFFFF" w:sz="0"/>
-            </w:tcBorders>
-            <w:tcMar>
-              <w:top w:type="dxa" w:w="70"/>
-              <w:left w:type="dxa" w:w="100"/>
-              <w:bottom w:type="dxa" w:w="70"/>
-              <w:right w:type="dxa" w:w="100"/>
-            </w:tcMar>
-          </w:tcPr>
-          <w:p>
-            <w:pPr>
-              <w:spacing w:after="0" w:line="260"/>
-            </w:pPr>
-            <w:r>
-              <w:rPr>
-                <w:rFonts w:ascii="Calibri" w:cs="Calibri" w:eastAsia="Calibri" w:hAnsi="Calibri"/>
-                <w:b w:val="false"/>
-                <w:bCs w:val="false"/>
-                <w:color w:val="000000"/>
-                <w:sz w:val="20"/>
-                <w:szCs w:val="20"/>
-              </w:rPr>
-              <w:t xml:space="preserve">Document parsers and OCR, feature pipeline, risk model, web application, tests, GitHub and Vercel deployment, live demo</w:t>
-            </w:r>
-          </w:p>
-        </w:tc>
-      </w:tr>
-      <w:tr>
-        <w:trPr>
-          <w:cantSplit/>
-        </w:trPr>
-        <w:tc>
-          <w:tcPr>
-            <w:tcW w:type="dxa" w:w="2600"/>
-            <w:tcBorders>
-              <w:top w:val="single" w:color="C9D6CF" w:sz="4"/>
-              <w:left w:val="none" w:color="FFFFFF" w:sz="0"/>
-              <w:bottom w:val="single" w:color="C9D6CF" w:sz="4"/>
-              <w:right w:val="none" w:color="FFFFFF" w:sz="0"/>
-            </w:tcBorders>
-            <w:tcMar>
-              <w:top w:type="dxa" w:w="70"/>
-              <w:left w:type="dxa" w:w="100"/>
-              <w:bottom w:type="dxa" w:w="70"/>
-              <w:right w:type="dxa" w:w="100"/>
-            </w:tcMar>
-          </w:tcPr>
-          <w:p>
-            <w:pPr>
-              <w:spacing w:after="0" w:line="260"/>
-            </w:pPr>
-            <w:r>
-              <w:rPr>
-                <w:rFonts w:ascii="Calibri" w:cs="Calibri" w:eastAsia="Calibri" w:hAnsi="Calibri"/>
-                <w:b w:val="false"/>
-                <w:bCs w:val="false"/>
-                <w:color w:val="000000"/>
-                <w:sz w:val="20"/>
-                <w:szCs w:val="20"/>
-              </w:rPr>
-              <w:t xml:space="preserve">Research and data</w:t>
-            </w:r>
-          </w:p>
-        </w:tc>
-        <w:tc>
-          <w:tcPr>
-            <w:tcW w:type="dxa" w:w="6426"/>
-            <w:tcBorders>
-              <w:top w:val="single" w:color="C9D6CF" w:sz="4"/>
-              <w:left w:val="none" w:color="FFFFFF" w:sz="0"/>
-              <w:bottom w:val="single" w:color="C9D6CF" w:sz="4"/>
-              <w:right w:val="none" w:color="FFFFFF" w:sz="0"/>
-            </w:tcBorders>
-            <w:tcMar>
-              <w:top w:type="dxa" w:w="70"/>
-              <w:left w:type="dxa" w:w="100"/>
-              <w:bottom w:type="dxa" w:w="70"/>
-              <w:right w:type="dxa" w:w="100"/>
-            </w:tcMar>
-          </w:tcPr>
-          <w:p>
-            <w:pPr>
-              <w:spacing w:after="0" w:line="260"/>
-            </w:pPr>
-            <w:r>
-              <w:rPr>
-                <w:rFonts w:ascii="Calibri" w:cs="Calibri" w:eastAsia="Calibri" w:hAnsi="Calibri"/>
-                <w:b w:val="false"/>
-                <w:bCs w:val="false"/>
-                <w:color w:val="000000"/>
-                <w:sz w:val="20"/>
-                <w:szCs w:val="20"/>
-              </w:rPr>
-              <w:t xml:space="preserve">Regulation mapping and quotes, public anchors (wages, BRV, MKBANK figures), synthetic-data calibration, Berka validation, evaluation numbers</w:t>
-            </w:r>
-          </w:p>
-        </w:tc>
-      </w:tr>
-      <w:tr>
-        <w:trPr>
-          <w:cantSplit/>
-        </w:trPr>
-        <w:tc>
-          <w:tcPr>
-            <w:tcW w:type="dxa" w:w="2600"/>
-            <w:tcBorders>
-              <w:top w:val="single" w:color="C9D6CF" w:sz="4"/>
-              <w:left w:val="none" w:color="FFFFFF" w:sz="0"/>
-              <w:bottom w:val="single" w:color="C9D6CF" w:sz="4"/>
-              <w:right w:val="none" w:color="FFFFFF" w:sz="0"/>
-            </w:tcBorders>
-            <w:tcMar>
-              <w:top w:type="dxa" w:w="70"/>
-              <w:left w:type="dxa" w:w="100"/>
-              <w:bottom w:type="dxa" w:w="70"/>
-              <w:right w:type="dxa" w:w="100"/>
-            </w:tcMar>
-          </w:tcPr>
-          <w:p>
-            <w:pPr>
-              <w:spacing w:after="0" w:line="260"/>
-            </w:pPr>
-            <w:r>
-              <w:rPr>
-                <w:rFonts w:ascii="Calibri" w:cs="Calibri" w:eastAsia="Calibri" w:hAnsi="Calibri"/>
-                <w:b w:val="false"/>
-                <w:bCs w:val="false"/>
-                <w:color w:val="000000"/>
-                <w:sz w:val="20"/>
-                <w:szCs w:val="20"/>
-              </w:rPr>
-              <w:t xml:space="preserve">Compliance and business case</w:t>
-            </w:r>
-          </w:p>
-        </w:tc>
-        <w:tc>
-          <w:tcPr>
-            <w:tcW w:type="dxa" w:w="6426"/>
-            <w:tcBorders>
-              <w:top w:val="single" w:color="C9D6CF" w:sz="4"/>
-              <w:left w:val="none" w:color="FFFFFF" w:sz="0"/>
-              <w:bottom w:val="single" w:color="C9D6CF" w:sz="4"/>
-              <w:right w:val="none" w:color="FFFFFF" w:sz="0"/>
-            </w:tcBorders>
-            <w:tcMar>
-              <w:top w:type="dxa" w:w="70"/>
-              <w:left w:type="dxa" w:w="100"/>
-              <w:bottom w:type="dxa" w:w="70"/>
-              <w:right w:type="dxa" w:w="100"/>
-            </w:tcMar>
-          </w:tcPr>
-          <w:p>
-            <w:pPr>
-              <w:spacing w:after="0" w:line="260"/>
-            </w:pPr>
-            <w:r>
-              <w:rPr>
-                <w:rFonts w:ascii="Calibri" w:cs="Calibri" w:eastAsia="Calibri" w:hAnsi="Calibri"/>
-                <w:b w:val="false"/>
-                <w:bCs w:val="false"/>
-                <w:color w:val="000000"/>
-                <w:sz w:val="20"/>
-                <w:szCs w:val="20"/>
-              </w:rPr>
-              <w:t xml:space="preserve">ПДН rules and exemptions, data-protection design, pilot budget and ROI, defence deck</w:t>
-            </w:r>
-          </w:p>
-        </w:tc>
-      </w:tr>
-    </w:tbl>
-    <w:p>
-      <w:pPr>
-        <w:spacing w:after="120"/>
-      </w:pPr>
-    </w:p>
-    <w:p>
-      <w:pPr>
-        <w:pStyle w:val="Heading2"/>
-        <w:keepNext/>
-        <w:spacing w:after="100" w:before="260"/>
-      </w:pPr>
-      <w:r>
-        <w:rPr>
-          <w:rFonts w:ascii="Cambria" w:cs="Cambria" w:eastAsia="Cambria" w:hAnsi="Cambria"/>
-          <w:b/>
-          <w:bCs/>
-          <w:color w:val="1F4E3D"/>
-          <w:sz w:val="26"/>
-          <w:szCs w:val="26"/>
-        </w:rPr>
-        <w:t xml:space="preserve">11. Links and files</w:t>
+        <w:t xml:space="preserve">10. Links and files</w:t>
       </w:r>
     </w:p>
     <w:p>
@@ -3241,7 +2906,7 @@
         </w:rPr>
         <w:t xml:space="preserve">Live prototype: </w:t>
       </w:r>
-      <w:hyperlink w:history="1" r:id="rIdscq-krg6e-kq0dxvvoycf">
+      <w:hyperlink w:history="1" r:id="rIdg9rvmcqmfnmmwzzvn2app">
         <w:r>
           <w:rPr>
             <w:rFonts w:ascii="Calibri" w:cs="Calibri" w:eastAsia="Calibri" w:hAnsi="Calibri"/>
@@ -3281,7 +2946,7 @@
         </w:rPr>
         <w:t xml:space="preserve">Repository: </w:t>
       </w:r>
-      <w:hyperlink w:history="1" r:id="rIdqtghaigblq5nk_irirjnm">
+      <w:hyperlink w:history="1" r:id="rIdmf44fyjcazfktnfz5mqp3">
         <w:r>
           <w:rPr>
             <w:rFonts w:ascii="Calibri" w:cs="Calibri" w:eastAsia="Calibri" w:hAnsi="Calibri"/>
@@ -3321,7 +2986,7 @@
         </w:rPr>
         <w:t xml:space="preserve">Model card page: </w:t>
       </w:r>
-      <w:hyperlink w:history="1" r:id="rIdc0h15o94wrownkimljamd">
+      <w:hyperlink w:history="1" r:id="rIdblfcobp0npb5y2k2pheaw">
         <w:r>
           <w:rPr>
             <w:rFonts w:ascii="Calibri" w:cs="Calibri" w:eastAsia="Calibri" w:hAnsi="Calibri"/>
@@ -3413,7 +3078,7 @@
           <w:sz w:val="26"/>
           <w:szCs w:val="26"/>
         </w:rPr>
-        <w:t xml:space="preserve">12. Glossary</w:t>
+        <w:t xml:space="preserve">11. Glossary</w:t>
       </w:r>
     </w:p>
     <w:tbl>

</xml_diff>

<commit_message>
Docs and deck on Regulation 3618; Westminster Harvard reference list (docs/REFERENCES.md, Appendix D, Word explainer with in-text citations); MKBANK 2026 figure worded as programme projects
Co-Authored-By: Claude Fable 5.1 <noreply@anthropic.com>
Claude-Session: https://claude.ai/code/session_01Xf5A9DfRgzoaeNELy2iEQH
</commit_message>
<xml_diff>
--- a/docs/Daromad_project_explained.docx
+++ b/docs/Daromad_project_explained.docx
@@ -96,7 +96,7 @@
         </w:rPr>
         <w:t xml:space="preserve">Live prototype: </w:t>
       </w:r>
-      <w:hyperlink w:history="1" r:id="rIdmtxz-u7olnra-vmwhix9o">
+      <w:hyperlink w:history="1" r:id="rIdw9yb0rlxogp18s-q5lpzp">
         <w:r>
           <w:rPr>
             <w:rFonts w:ascii="Calibri" w:cs="Calibri" w:eastAsia="Calibri" w:hAnsi="Calibri"/>
@@ -123,7 +123,7 @@
         </w:rPr>
         <w:t xml:space="preserve">Source code: </w:t>
       </w:r>
-      <w:hyperlink w:history="1" r:id="rIdc2culx-a4ariizsqtno1s">
+      <w:hyperlink w:history="1" r:id="rIdecqwassvuhhk7tfhnjrla">
         <w:r>
           <w:rPr>
             <w:rFonts w:ascii="Calibri" w:cs="Calibri" w:eastAsia="Calibri" w:hAnsi="Calibri"/>
@@ -266,7 +266,7 @@
           <w:sz w:val="22"/>
           <w:szCs w:val="22"/>
         </w:rPr>
-        <w:t xml:space="preserve">In Uzbekistan a large part of the economy is self-employed people and family businesses: a seamstress, a taxi driver, a small shop, a home bakery. They receive money on bank cards and wallets (Humo, Uzcard, Payme, Click, Uzum) but they have no employer, no salary certificate and, as self-employed, they do not file a tax return. When they ask a bank for a loan, the bank must by law calculate their income and their debt-burden ratio (ПДН) — but the only evidence the regulation accepts for them is "income credited to bank accounts", in other words their statements.</w:t>
+        <w:t xml:space="preserve">In Uzbekistan a large part of the economy is self-employed people and family businesses: a seamstress, a taxi driver, a small shop, a home bakery. They receive money on bank cards and wallets (Humo, Uzcard, Payme, Click, Uzum) but they have no employer, no salary certificate and, as self-employed, they do not file a tax return. When they ask a bank for a loan, the bank must by law calculate their income and their debt-burden ratio (ПДН) — but the only evidence the regulation accepts for them is the money credited to their bank accounts (Central Bank of the Republic of Uzbekistan, 2025, clause 18), in other words their statements.</w:t>
       </w:r>
     </w:p>
     <w:p>
@@ -279,7 +279,7 @@
           <w:sz w:val="22"/>
           <w:szCs w:val="22"/>
         </w:rPr>
-        <w:t xml:space="preserve">Today a credit officer does this by hand: downloads a 12-month statement, scrolls through hundreds of lines, guesses which lines are business income and which are transfers from relatives, adds them up in Excel, divides by 12, and types the result into a memo. It takes about an hour and a half per applicant, it is inconsistent between officers, and a forged statement is hard to notice. MKBANK, the hackathon partner, financed about 48,000 such micro-projects in 2025 and targets about 140,000 in 2026 — so this manual hour is repeated more than a hundred thousand times a year.</w:t>
+        <w:t xml:space="preserve">Today a credit officer does this by hand: downloads a 12-month statement, scrolls through hundreds of lines, guesses which lines are business income and which are transfers from relatives, adds them up in Excel, divides by 12, and types the result into a memo. It takes about an hour and a half per applicant, it is inconsistent between officers, and a forged statement is hard to notice. MKBANK, the hackathon partner, financed about 48,000 such micro-projects in 2025 and plans about 140,000 projects under its lending programmes in 2026 (Spot, 2026), and close to 800,000 people are registered as self-employed (Yuz.uz, 2021) — so this manual hour is repeated more than a hundred thousand times a year.</w:t>
       </w:r>
     </w:p>
     <w:p>
@@ -438,7 +438,7 @@
           <w:sz w:val="22"/>
           <w:szCs w:val="22"/>
         </w:rPr>
-        <w:t xml:space="preserve">We studied the Central Bank regulation on the debt-burden ratio (lex.uz document 4654149 as amended by Board Resolution 42/16, document 6809992): how income is defined (12-month arithmetic mean, clause 7), which evidence is accepted (clause 9 — including income credited to bank accounts), the 50 % cap (clause 10), how long loans are spread over 36 or 180 months, when guarantors count (only if the guaranteed loan is more than 30 days overdue), the family-programme exemption (clause 11), and the lender-type reliefs (a bank only gets a 15 % portfolio quota; the 50-BRV and 75-BRV exclusions are for microfinance organisations and pawnshops). We copied the exact Uzbek wording into docs/REGULATION_QUOTES.md so that every rule in the code points to a quote.</w:t>
+        <w:t xml:space="preserve">We studied the Central Bank regulation that governs bank lending to individuals since 24 July 2025 — Regulation No. 3618 "on macroprudential norms set for banks and on the maximum values of payments on loans (microloans) issued by them" (Central Bank of the Republic of Uzbekistan, 2025) — clause by clause: how the ratio is defined (clause 2), the 50 % limit and the two 15 % quotas (clause 3), which loans are exempt — individual entrepreneurs, family-entrepreneurship programmes, education loans (clause 4), which obligations count and when a guarantor counts — only if the guaranteed loan is more than 30 days late (clause 7), how long loans are spread over 36, 60 or 180 months (clause 8), the 3-working-day window between calculation and issue (clause 12), how income is averaged over 6 to 12 months (clause 13) with the option to use the median when it is lower (clause 14), that receipts on the borrower's bank accounts count as income (clause 18) and what documented evidence looks like (clause 19). We also checked the older regulation No. 3205 (Central Bank of the Republic of Uzbekistan, 2019): since July 2025 it covers only microfinance organisations and pawnshops, so it does not apply to MKBANK. The exact Uzbek wording is in docs/REGULATION_QUOTES.md, so every rule in the code points to a quote.</w:t>
       </w:r>
     </w:p>
     <w:p>
@@ -466,7 +466,7 @@
           <w:sz w:val="22"/>
           <w:szCs w:val="22"/>
         </w:rPr>
-        <w:t xml:space="preserve">Average wages from stat.uz, the BRV value (440,000 UZS from 1 September 2026), MKBANK's own published figures and product terms (Ommabop 2 up to 50 million, Express and Business Online 2 up to 100 million, the family-entrepreneurship programme), and the licences of every library we planned to use. All of this is in docs/DATA_SOURCES.md.</w:t>
+        <w:t xml:space="preserve">Average wages from stat.uz, MKBANK's own published figures and product terms (Ommabop 2 up to 50 million, Express and Business Online 2 up to 100 million, the family-entrepreneurship programme), and the licences of every library we planned to use. All of this is in docs/DATA_SOURCES.md.</w:t>
       </w:r>
     </w:p>
     <w:p>
@@ -522,7 +522,7 @@
           <w:sz w:val="22"/>
           <w:szCs w:val="22"/>
         </w:rPr>
-        <w:t xml:space="preserve">From each borrower's transactions we compute 18 cash-flow features (income level, stability, trend, share of business income, cash buffer in months, repayment burden, and so on). We trained a gradient-boosted-tree model (XGBoost) with monotone constraints — meaning the risk committee can confirm that, for example, more stable income can only lower the score, never raise it. We compared it with logistic regression and with the debt-burden ratio alone, and exported the model as a plain JSON file so that the browser can run it without any server.</w:t>
+        <w:t xml:space="preserve">From each borrower's transactions we compute 18 cash-flow features (income level, stability, trend, share of business income, cash buffer in months, repayment burden, and so on). We trained a gradient-boosted-tree model (XGBoost; Chen and Guestrin, 2016) with monotone constraints — meaning the risk committee can confirm that, for example, more stable income can only lower the score, never raise it. We compared it with logistic regression and with the debt-burden ratio alone, and exported the model as a plain JSON file so that the browser can run it without any server.</w:t>
       </w:r>
     </w:p>
     <w:p>
@@ -550,7 +550,7 @@
           <w:sz w:val="22"/>
           <w:szCs w:val="22"/>
         </w:rPr>
-        <w:t xml:space="preserve">Because a model trained on our own synthetic population only proves the pipeline, we ran the same 18 features on the public Berka data set (a real Czech bank, 1999, 443 loans of which 44 went bad). The cash-flow features carry real signal there too (AUC 0.90 versus 0.74 for the ratio alone).</w:t>
+        <w:t xml:space="preserve">Because a model trained on our own synthetic population only proves the pipeline, we ran the same 18 features on the public Berka data set (Berka and Sochorová, 1999; a real Czech bank, 443 loans of which 44 went bad). The cash-flow features carry real signal there too (AUC 0.90 versus 0.74 for the ratio alone).</w:t>
       </w:r>
     </w:p>
     <w:p>
@@ -718,7 +718,7 @@
           <w:sz w:val="22"/>
           <w:szCs w:val="22"/>
         </w:rPr>
-        <w:t xml:space="preserve">Round one: fixed the mobile layout, the memo verifier, the BRV constant (412,000 → 440,000), a ten-fold error in the ROI arithmetic, borrower names and genders in the samples, and made the parsers handle Unicode minus signs, quoted CSV fields and type columns; the receipt fields became part of the integrity checks. Round two: lender-type rules (a bank gets no small-loan exclusion — the ratio is always computed and the 15 % quota is shown as a note), a false "skipped line" warning removed, a slide overflow fixed, and a safety net added so that a statement whose rows have no debit/credit direction cannot be counted as pure income — it raises a high-severity finding and goes to the committee.</w:t>
+        <w:t xml:space="preserve">Round one: fixed the mobile layout, the memo verifier, a ten-fold error in the ROI arithmetic, borrower names and genders in the samples, and made the parsers handle Unicode minus signs, quoted CSV fields and type columns; the receipt fields became part of the integrity checks. Round two: a false "skipped line" warning removed, a slide overflow fixed, and a safety net added so that a statement whose rows have no debit/credit direction cannot be counted as pure income — it raises a high-severity finding and goes to the committee.</w:t>
       </w:r>
     </w:p>
     <w:p>
@@ -912,7 +912,7 @@
           <w:sz w:val="22"/>
           <w:szCs w:val="22"/>
         </w:rPr>
-        <w:t xml:space="preserve">Product (Ommabop 2, Express, Business Online 2, family programme), amount, term, rate per annum, lender type (bank by default) and a table of existing obligations (what the borrower already pays each month).</w:t>
+        <w:t xml:space="preserve">Product (Ommabop 2, Express, Business Online 2, family programme), amount, term, rate per annum and a table of existing obligations (what the borrower already pays each month).</w:t>
       </w:r>
     </w:p>
     <w:p>
@@ -1139,7 +1139,7 @@
           <w:sz w:val="22"/>
           <w:szCs w:val="22"/>
         </w:rPr>
-        <w:t xml:space="preserve">A PDF statement is opened with pdf.js, which gives us every word with its position on the page. We find the header row (date, description, debit, credit, balance in Russian, Uzbek or English), then cluster the numbers by their horizontal position so that each column is recognised even in a layout we have never seen. Excel and CSV files are read with SheetJS; we find the header row by its words, understand many column conventions (separate debit/credit columns, one signed amount column, a type column that says "credit/debit", "kirim/chiqim", "приход/расход" or "+/−"), skip failed or cancelled payments, and ignore identifier columns such as payment numbers. Amounts are cleaned of spaces, non-breaking spaces, currency words and Unicode minus signs. Receipt photos go through Tesseract OCR with Uzbek, Russian and English models hosted in our own site; we then pull out the total, the seller's INN, the date and the receipt number with pattern rules. The self-employed certificate is read for the name, INN, registration date and status.</w:t>
+        <w:t xml:space="preserve">A PDF statement is opened with pdf.js (Mozilla, 2025), which gives us every word with its position on the page. We find the header row (date, description, debit, credit, balance in Russian, Uzbek or English), then cluster the numbers by their horizontal position so that each column is recognised even in a layout we have never seen. Excel and CSV files are read with SheetJS (SheetJS LLC, 2024); we find the header row by its words, understand many column conventions (separate debit/credit columns, one signed amount column, a type column that says "credit/debit", "kirim/chiqim", "приход/расход" or "+/−"), skip failed or cancelled payments, and ignore identifier columns such as payment numbers. Amounts are cleaned of spaces, non-breaking spaces, currency words and Unicode minus signs. Receipt photos go through Tesseract OCR (Smith, 2007) with Uzbek, Russian and English models hosted in our own site; we then pull out the total, the seller's INN, the date and the receipt number with pattern rules. The self-employed certificate is read for the name, INN, registration date and status.</w:t>
       </w:r>
     </w:p>
     <w:p>
@@ -1195,7 +1195,7 @@
           <w:sz w:val="22"/>
           <w:szCs w:val="22"/>
         </w:rPr>
-        <w:t xml:space="preserve">We take the last 12 full months before the application date, add the business-revenue inflows per month, and compute the arithmetic mean — exactly the method in clause 7 of the regulation, with account inflows as the accepted evidence under clause 9. Family transfers and the borrower's own transfers are shown but not counted. If fewer than 12 months are available, the engine says so and the integrity check marks the coverage as a finding.</w:t>
+        <w:t xml:space="preserve">We take the months before the application date for which the statement has data — at least 6 and at most 12, as clause 13 requires — add the business-revenue inflows per month and compute the arithmetic mean (one-twelfth of twelve months, or one-sixth to one-eleventh when fewer exist). Receipts on the borrower's own bank accounts are accepted evidence under clause 18. If the median month is lower than the mean, clause 14 lets the bank use the median, and the screen has a switch for that. Family transfers and the borrower's own transfers are shown but not counted. With fewer than 6 months the ratio is only indicative and the case goes to the committee.</w:t>
       </w:r>
     </w:p>
     <w:p>
@@ -1223,7 +1223,7 @@
           <w:sz w:val="22"/>
           <w:szCs w:val="22"/>
         </w:rPr>
-        <w:t xml:space="preserve">Monthly payments of the new loan and of every existing obligation are divided by the income figure. Long loans are spread over 36 months (180 for mortgages). Co-borrowers always count; guarantors only if the guaranteed loan is more than 30 days overdue. The ratio must stay at or below 50 %. The lender type matters: for a bank (the default, as MKBANK is a bank) there is no small-loan exclusion — the ratio is computed for every application and the bank's 15 % portfolio quota is shown as a note; only if the lender type is changed to microfinance organisation or pawnshop do the 50-BRV (22 million UZS) or 75-BRV (33 million, for self-employed borrowers at an MFO) exclusions apply. Family-programme loans are exempt under clause 11, and the screen says so. Finally the engine back-solves the maximum amount at which the ratio is exactly at the cap, so the officer immediately sees what can be offered. Every output line carries its clause reference.</w:t>
+        <w:t xml:space="preserve">Monthly payments of the new loan and of every existing obligation are divided by the income figure. Long loans are spread: a microloan over 36 months is treated as 36, another loan over 60 months as 60, a mortgage over 180 as 180 (clause 8). Co-borrowers always count; guarantors only if the guaranteed loan is more than 30 days overdue (clause 7). The ratio must stay at or below 50 % (clause 3). Between 50 % and 100 % a bank may still lend, but only inside a quota of 15 % of its outstanding loans — a bank-level decision, so the engine sends such a case to the committee. A self-employed person registered less than six months ago may, for an income-generating loan, be financed without the ratio inside another 15 % quota, and the engine flags that eligibility. Loans under family-entrepreneurship programmes, to individual entrepreneurs and for education are exempt (clause 4), and the screen says so. Finally the engine back-solves the maximum amount at which the ratio is exactly at the limit, so the officer immediately sees what can be offered. Every output line carries its clause reference.</w:t>
       </w:r>
     </w:p>
     <w:p>
@@ -2802,6 +2802,75 @@
     </w:p>
     <w:p>
       <w:pPr>
+        <w:spacing w:after="120"/>
+      </w:pPr>
+    </w:p>
+    <w:p>
+      <w:pPr>
+        <w:pBdr>
+          <w:left w:val="single" w:color="D98E04" w:sz="24" w:space="8"/>
+        </w:pBdr>
+        <w:shd w:fill="EEF3F0" w:color="auto" w:val="clear"/>
+        <w:spacing w:after="200" w:before="120" w:line="290"/>
+        <w:ind w:left="240" w:right="240"/>
+      </w:pPr>
+      <w:r>
+        <w:rPr>
+          <w:rFonts w:ascii="Calibri" w:cs="Calibri" w:eastAsia="Calibri" w:hAnsi="Calibri"/>
+          <w:b/>
+          <w:bCs/>
+          <w:sz w:val="22"/>
+          <w:szCs w:val="22"/>
+        </w:rPr>
+        <w:t xml:space="preserve">One line to remember: </w:t>
+      </w:r>
+      <w:r>
+        <w:rPr>
+          <w:rFonts w:ascii="Calibri" w:cs="Calibri" w:eastAsia="Calibri" w:hAnsi="Calibri"/>
+          <w:sz w:val="22"/>
+          <w:szCs w:val="22"/>
+        </w:rPr>
+        <w:t xml:space="preserve">Daromad turns the statements a self-employed borrower already has into a regulator-compliant, tamper-checked, fully traceable credit decision — in the browser, in under a minute, at zero marginal cost.</w:t>
+      </w:r>
+    </w:p>
+    <w:p>
+      <w:pPr>
+        <w:pStyle w:val="Heading1"/>
+        <w:keepNext/>
+        <w:spacing w:after="160" w:before="360"/>
+      </w:pPr>
+      <w:r>
+        <w:rPr>
+          <w:rFonts w:ascii="Cambria" w:cs="Cambria" w:eastAsia="Cambria" w:hAnsi="Cambria"/>
+          <w:b/>
+          <w:bCs/>
+          <w:color w:val="1F4E3D"/>
+          <w:sz w:val="32"/>
+          <w:szCs w:val="32"/>
+        </w:rPr>
+        <w:t xml:space="preserve">Part E — Links and glossary</w:t>
+      </w:r>
+    </w:p>
+    <w:p>
+      <w:pPr>
+        <w:pStyle w:val="Heading2"/>
+        <w:keepNext/>
+        <w:spacing w:after="100" w:before="260"/>
+      </w:pPr>
+      <w:r>
+        <w:rPr>
+          <w:rFonts w:ascii="Cambria" w:cs="Cambria" w:eastAsia="Cambria" w:hAnsi="Cambria"/>
+          <w:b/>
+          <w:bCs/>
+          <w:color w:val="1F4E3D"/>
+          <w:sz w:val="26"/>
+          <w:szCs w:val="26"/>
+        </w:rPr>
+        <w:t xml:space="preserve">10. Links and files</w:t>
+      </w:r>
+    </w:p>
+    <w:p>
+      <w:pPr>
         <w:pStyle w:val="ListParagraph"/>
         <w:numPr>
           <w:ilvl w:val="0"/>
@@ -2812,93 +2881,6 @@
       <w:r>
         <w:rPr>
           <w:rFonts w:ascii="Calibri" w:cs="Calibri" w:eastAsia="Calibri" w:hAnsi="Calibri"/>
-          <w:sz w:val="22"/>
-          <w:szCs w:val="22"/>
-        </w:rPr>
-        <w:t xml:space="preserve">The BRV value is a configuration constant (440,000 UZS from 1 September 2026) and must be updated when it changes.</w:t>
-      </w:r>
-    </w:p>
-    <w:p>
-      <w:pPr>
-        <w:spacing w:after="120"/>
-      </w:pPr>
-    </w:p>
-    <w:p>
-      <w:pPr>
-        <w:pBdr>
-          <w:left w:val="single" w:color="D98E04" w:sz="24" w:space="8"/>
-        </w:pBdr>
-        <w:shd w:fill="EEF3F0" w:color="auto" w:val="clear"/>
-        <w:spacing w:after="200" w:before="120" w:line="290"/>
-        <w:ind w:left="240" w:right="240"/>
-      </w:pPr>
-      <w:r>
-        <w:rPr>
-          <w:rFonts w:ascii="Calibri" w:cs="Calibri" w:eastAsia="Calibri" w:hAnsi="Calibri"/>
-          <w:b/>
-          <w:bCs/>
-          <w:sz w:val="22"/>
-          <w:szCs w:val="22"/>
-        </w:rPr>
-        <w:t xml:space="preserve">One line to remember: </w:t>
-      </w:r>
-      <w:r>
-        <w:rPr>
-          <w:rFonts w:ascii="Calibri" w:cs="Calibri" w:eastAsia="Calibri" w:hAnsi="Calibri"/>
-          <w:sz w:val="22"/>
-          <w:szCs w:val="22"/>
-        </w:rPr>
-        <w:t xml:space="preserve">Daromad turns the statements a self-employed borrower already has into a regulator-compliant, tamper-checked, fully traceable credit decision — in the browser, in under a minute, at zero marginal cost.</w:t>
-      </w:r>
-    </w:p>
-    <w:p>
-      <w:pPr>
-        <w:pStyle w:val="Heading1"/>
-        <w:keepNext/>
-        <w:spacing w:after="160" w:before="360"/>
-      </w:pPr>
-      <w:r>
-        <w:rPr>
-          <w:rFonts w:ascii="Cambria" w:cs="Cambria" w:eastAsia="Cambria" w:hAnsi="Cambria"/>
-          <w:b/>
-          <w:bCs/>
-          <w:color w:val="1F4E3D"/>
-          <w:sz w:val="32"/>
-          <w:szCs w:val="32"/>
-        </w:rPr>
-        <w:t xml:space="preserve">Part E — Links and glossary</w:t>
-      </w:r>
-    </w:p>
-    <w:p>
-      <w:pPr>
-        <w:pStyle w:val="Heading2"/>
-        <w:keepNext/>
-        <w:spacing w:after="100" w:before="260"/>
-      </w:pPr>
-      <w:r>
-        <w:rPr>
-          <w:rFonts w:ascii="Cambria" w:cs="Cambria" w:eastAsia="Cambria" w:hAnsi="Cambria"/>
-          <w:b/>
-          <w:bCs/>
-          <w:color w:val="1F4E3D"/>
-          <w:sz w:val="26"/>
-          <w:szCs w:val="26"/>
-        </w:rPr>
-        <w:t xml:space="preserve">10. Links and files</w:t>
-      </w:r>
-    </w:p>
-    <w:p>
-      <w:pPr>
-        <w:pStyle w:val="ListParagraph"/>
-        <w:numPr>
-          <w:ilvl w:val="0"/>
-          <w:numId w:val="3"/>
-        </w:numPr>
-        <w:spacing w:after="80" w:line="290"/>
-      </w:pPr>
-      <w:r>
-        <w:rPr>
-          <w:rFonts w:ascii="Calibri" w:cs="Calibri" w:eastAsia="Calibri" w:hAnsi="Calibri"/>
           <w:b/>
           <w:bCs/>
           <w:sz w:val="22"/>
@@ -2906,7 +2888,7 @@
         </w:rPr>
         <w:t xml:space="preserve">Live prototype: </w:t>
       </w:r>
-      <w:hyperlink w:history="1" r:id="rIdg9rvmcqmfnmmwzzvn2app">
+      <w:hyperlink w:history="1" r:id="rIducztmfcmt5kmjj06a8nom">
         <w:r>
           <w:rPr>
             <w:rFonts w:ascii="Calibri" w:cs="Calibri" w:eastAsia="Calibri" w:hAnsi="Calibri"/>
@@ -2946,7 +2928,7 @@
         </w:rPr>
         <w:t xml:space="preserve">Repository: </w:t>
       </w:r>
-      <w:hyperlink w:history="1" r:id="rIdmf44fyjcazfktnfz5mqp3">
+      <w:hyperlink w:history="1" r:id="rIdwfkr0othvqz_ett0ojavp">
         <w:r>
           <w:rPr>
             <w:rFonts w:ascii="Calibri" w:cs="Calibri" w:eastAsia="Calibri" w:hAnsi="Calibri"/>
@@ -2986,7 +2968,7 @@
         </w:rPr>
         <w:t xml:space="preserve">Model card page: </w:t>
       </w:r>
-      <w:hyperlink w:history="1" r:id="rIdblfcobp0npb5y2k2pheaw">
+      <w:hyperlink w:history="1" r:id="rIdwgignqxw7rfovtlk67cow">
         <w:r>
           <w:rPr>
             <w:rFonts w:ascii="Calibri" w:cs="Calibri" w:eastAsia="Calibri" w:hAnsi="Calibri"/>
@@ -3237,7 +3219,7 @@
                 <w:sz w:val="20"/>
                 <w:szCs w:val="20"/>
               </w:rPr>
-              <w:t xml:space="preserve">Monthly loan payments divided by monthly income. The Central Bank caps it at 50 % for loans to individuals (clause 10). Also called "қарз юки кўрсаткичи".</w:t>
+              <w:t xml:space="preserve">Monthly loan payments divided by monthly income. For bank loans the Central Bank limits it to 50 % (Regulation 3618, clause 3). Also called "қарз юки кўрсаткичи".</w:t>
             </w:r>
           </w:p>
         </w:tc>
@@ -3275,7 +3257,7 @@
                 <w:sz w:val="20"/>
                 <w:szCs w:val="20"/>
               </w:rPr>
-              <w:t xml:space="preserve">BRV</w:t>
+              <w:t xml:space="preserve">Thin-file borrower</w:t>
             </w:r>
           </w:p>
         </w:tc>
@@ -3308,7 +3290,7 @@
                 <w:sz w:val="20"/>
                 <w:szCs w:val="20"/>
               </w:rPr>
-              <w:t xml:space="preserve">Base calculation value (базовая расчётная величина), a reference amount set by the state and used in laws instead of fixed sums. 440,000 UZS from 1 September 2026; 50 BRV = 22 million, 75 BRV = 33 million.</w:t>
+              <w:t xml:space="preserve">A person with little or no credit history and no formal income documents — typical for the self-employed.</w:t>
             </w:r>
           </w:p>
         </w:tc>
@@ -3346,7 +3328,7 @@
                 <w:sz w:val="20"/>
                 <w:szCs w:val="20"/>
               </w:rPr>
-              <w:t xml:space="preserve">Thin-file borrower</w:t>
+              <w:t xml:space="preserve">15 % quotas</w:t>
             </w:r>
           </w:p>
         </w:tc>
@@ -3379,7 +3361,7 @@
                 <w:sz w:val="20"/>
                 <w:szCs w:val="20"/>
               </w:rPr>
-              <w:t xml:space="preserve">A person with little or no credit history and no formal income documents — typical for the self-employed.</w:t>
+              <w:t xml:space="preserve">Two bank-level allowances in clause 3 of Regulation 3618: up to 15 % of a bank's outstanding loans may carry a ratio between 50 % and 100 %, and up to 15 % may go to newly registered self-employed persons without the ratio. Both are decided at bank level, so Daromad refers such cases to the committee instead of approving them.</w:t>
             </w:r>
           </w:p>
         </w:tc>
@@ -3417,7 +3399,7 @@
                 <w:sz w:val="20"/>
                 <w:szCs w:val="20"/>
               </w:rPr>
-              <w:t xml:space="preserve">Lender type</w:t>
+              <w:t xml:space="preserve">KATM</w:t>
             </w:r>
           </w:p>
         </w:tc>
@@ -3450,7 +3432,7 @@
                 <w:sz w:val="20"/>
                 <w:szCs w:val="20"/>
               </w:rPr>
-              <w:t xml:space="preserve">Bank, microfinance organisation or pawnshop. The regulation gives different reliefs to each; MKBANK is a bank, so the ratio is always computed and only a 15 % portfolio quota applies.</w:t>
+              <w:t xml:space="preserve">The credit bureau (Credit Information Analytical Centre). It tells a bank what a borrower owes and how they repaid; Daromad tells the bank what the borrower earns. In production the obligations table is a KATM pull.</w:t>
             </w:r>
           </w:p>
         </w:tc>
@@ -3488,7 +3470,7 @@
                 <w:sz w:val="20"/>
                 <w:szCs w:val="20"/>
               </w:rPr>
-              <w:t xml:space="preserve">KATM</w:t>
+              <w:t xml:space="preserve">DPD</w:t>
             </w:r>
           </w:p>
         </w:tc>
@@ -3521,7 +3503,7 @@
                 <w:sz w:val="20"/>
                 <w:szCs w:val="20"/>
               </w:rPr>
-              <w:t xml:space="preserve">The credit bureau (Credit Information Analytical Centre). It tells a bank what a borrower owes and how they repaid; Daromad tells the bank what the borrower earns. In production the obligations table is a KATM pull.</w:t>
+              <w:t xml:space="preserve">Days past due — how many days a payment is late. 30+ DPD is the threshold at which a guaranteed loan starts to count against the guarantor (clause 7).</w:t>
             </w:r>
           </w:p>
         </w:tc>
@@ -3559,7 +3541,7 @@
                 <w:sz w:val="20"/>
                 <w:szCs w:val="20"/>
               </w:rPr>
-              <w:t xml:space="preserve">DPD</w:t>
+              <w:t xml:space="preserve">Rate p.a.</w:t>
             </w:r>
           </w:p>
         </w:tc>
@@ -3592,7 +3574,7 @@
                 <w:sz w:val="20"/>
                 <w:szCs w:val="20"/>
               </w:rPr>
-              <w:t xml:space="preserve">Days past due — how many days a payment is late. 30+ DPD is the threshold at which a guaranteed loan starts to count against the guarantor.</w:t>
+              <w:t xml:space="preserve">Interest rate per annum (per year), used to compute the monthly payment of the requested loan.</w:t>
             </w:r>
           </w:p>
         </w:tc>
@@ -3630,7 +3612,7 @@
                 <w:sz w:val="20"/>
                 <w:szCs w:val="20"/>
               </w:rPr>
-              <w:t xml:space="preserve">Rate p.a.</w:t>
+              <w:t xml:space="preserve">OCR</w:t>
             </w:r>
           </w:p>
         </w:tc>
@@ -3663,7 +3645,7 @@
                 <w:sz w:val="20"/>
                 <w:szCs w:val="20"/>
               </w:rPr>
-              <w:t xml:space="preserve">Interest rate per annum (per year), used to compute the monthly payment of the requested loan.</w:t>
+              <w:t xml:space="preserve">Optical character recognition — turning a photo of text into text. We use Tesseract with Uzbek Latin, Uzbek Cyrillic, Russian and English models, hosted on our own site.</w:t>
             </w:r>
           </w:p>
         </w:tc>
@@ -3701,7 +3683,7 @@
                 <w:sz w:val="20"/>
                 <w:szCs w:val="20"/>
               </w:rPr>
-              <w:t xml:space="preserve">OCR</w:t>
+              <w:t xml:space="preserve">Balance chain</w:t>
             </w:r>
           </w:p>
         </w:tc>
@@ -3734,7 +3716,7 @@
                 <w:sz w:val="20"/>
                 <w:szCs w:val="20"/>
               </w:rPr>
-              <w:t xml:space="preserve">Optical character recognition — turning a photo of text into text. We use Tesseract with Uzbek Latin, Uzbek Cyrillic, Russian and English models, hosted on our own site.</w:t>
+              <w:t xml:space="preserve">On a statement, each line's balance must equal the previous balance plus the credit minus the debit. If one line was edited or deleted, the chain breaks at that line.</w:t>
             </w:r>
           </w:p>
         </w:tc>
@@ -3772,7 +3754,7 @@
                 <w:sz w:val="20"/>
                 <w:szCs w:val="20"/>
               </w:rPr>
-              <w:t xml:space="preserve">Balance chain</w:t>
+              <w:t xml:space="preserve">Window dressing</w:t>
             </w:r>
           </w:p>
         </w:tc>
@@ -3805,7 +3787,7 @@
                 <w:sz w:val="20"/>
                 <w:szCs w:val="20"/>
               </w:rPr>
-              <w:t xml:space="preserve">On a statement, each line's balance must equal the previous balance plus the credit minus the debit. If one line was edited or deleted, the chain breaks at that line.</w:t>
+              <w:t xml:space="preserve">Depositing round sums shortly before applying for a loan to make income look higher. Detected by comparing the last 45 days with the earlier rate.</w:t>
             </w:r>
           </w:p>
         </w:tc>
@@ -3843,7 +3825,7 @@
                 <w:sz w:val="20"/>
                 <w:szCs w:val="20"/>
               </w:rPr>
-              <w:t xml:space="preserve">Window dressing</w:t>
+              <w:t xml:space="preserve">AUC</w:t>
             </w:r>
           </w:p>
         </w:tc>
@@ -3876,7 +3858,7 @@
                 <w:sz w:val="20"/>
                 <w:szCs w:val="20"/>
               </w:rPr>
-              <w:t xml:space="preserve">Depositing round sums shortly before applying for a loan to make income look higher. Detected by comparing the last 45 days with the earlier rate.</w:t>
+              <w:t xml:space="preserve">Area under the ROC curve: a 0.5–1.0 score for how well a model ranks risky borrowers above safe ones.</w:t>
             </w:r>
           </w:p>
         </w:tc>
@@ -3914,7 +3896,7 @@
                 <w:sz w:val="20"/>
                 <w:szCs w:val="20"/>
               </w:rPr>
-              <w:t xml:space="preserve">AUC</w:t>
+              <w:t xml:space="preserve">Monotone constraints</w:t>
             </w:r>
           </w:p>
         </w:tc>
@@ -3947,7 +3929,7 @@
                 <w:sz w:val="20"/>
                 <w:szCs w:val="20"/>
               </w:rPr>
-              <w:t xml:space="preserve">Area under the ROC curve: a 0.5–1.0 score for how well a model ranks risky borrowers above safe ones.</w:t>
+              <w:t xml:space="preserve">A rule given to the model during training: a feature may only push the risk in one direction (for example, more income may only lower the risk). It makes the model acceptable to a risk committee.</w:t>
             </w:r>
           </w:p>
         </w:tc>
@@ -3985,7 +3967,7 @@
                 <w:sz w:val="20"/>
                 <w:szCs w:val="20"/>
               </w:rPr>
-              <w:t xml:space="preserve">Monotone constraints</w:t>
+              <w:t xml:space="preserve">Hash chain</w:t>
             </w:r>
           </w:p>
         </w:tc>
@@ -4018,7 +4000,7 @@
                 <w:sz w:val="20"/>
                 <w:szCs w:val="20"/>
               </w:rPr>
-              <w:t xml:space="preserve">A rule given to the model during training: a feature may only push the risk in one direction (for example, more income may only lower the risk). It makes the model acceptable to a risk committee.</w:t>
+              <w:t xml:space="preserve">Each audit record contains the fingerprint (SHA-256 hash) of the previous record, so changing any record afterwards is detectable.</w:t>
             </w:r>
           </w:p>
         </w:tc>
@@ -4056,7 +4038,7 @@
                 <w:sz w:val="20"/>
                 <w:szCs w:val="20"/>
               </w:rPr>
-              <w:t xml:space="preserve">Hash chain</w:t>
+              <w:t xml:space="preserve">Static export</w:t>
             </w:r>
           </w:p>
         </w:tc>
@@ -4089,7 +4071,7 @@
                 <w:sz w:val="20"/>
                 <w:szCs w:val="20"/>
               </w:rPr>
-              <w:t xml:space="preserve">Each audit record contains the fingerprint (SHA-256 hash) of the previous record, so changing any record afterwards is detectable.</w:t>
+              <w:t xml:space="preserve">The website is a set of ready files (HTML, JavaScript) with no server-side code, so it can be hosted anywhere, including inside the bank.</w:t>
             </w:r>
           </w:p>
         </w:tc>
@@ -4127,77 +4109,6 @@
                 <w:sz w:val="20"/>
                 <w:szCs w:val="20"/>
               </w:rPr>
-              <w:t xml:space="preserve">Static export</w:t>
-            </w:r>
-          </w:p>
-        </w:tc>
-        <w:tc>
-          <w:tcPr>
-            <w:tcW w:type="dxa" w:w="6626"/>
-            <w:tcBorders>
-              <w:top w:val="single" w:color="C9D6CF" w:sz="4"/>
-              <w:left w:val="none" w:color="FFFFFF" w:sz="0"/>
-              <w:bottom w:val="single" w:color="C9D6CF" w:sz="4"/>
-              <w:right w:val="none" w:color="FFFFFF" w:sz="0"/>
-            </w:tcBorders>
-            <w:tcMar>
-              <w:top w:type="dxa" w:w="70"/>
-              <w:left w:type="dxa" w:w="100"/>
-              <w:bottom w:type="dxa" w:w="70"/>
-              <w:right w:type="dxa" w:w="100"/>
-            </w:tcMar>
-          </w:tcPr>
-          <w:p>
-            <w:pPr>
-              <w:spacing w:after="0" w:line="260"/>
-            </w:pPr>
-            <w:r>
-              <w:rPr>
-                <w:rFonts w:ascii="Calibri" w:cs="Calibri" w:eastAsia="Calibri" w:hAnsi="Calibri"/>
-                <w:b w:val="false"/>
-                <w:bCs w:val="false"/>
-                <w:color w:val="000000"/>
-                <w:sz w:val="20"/>
-                <w:szCs w:val="20"/>
-              </w:rPr>
-              <w:t xml:space="preserve">The website is a set of ready files (HTML, JavaScript) with no server-side code, so it can be hosted anywhere, including inside the bank.</w:t>
-            </w:r>
-          </w:p>
-        </w:tc>
-      </w:tr>
-      <w:tr>
-        <w:trPr>
-          <w:cantSplit/>
-        </w:trPr>
-        <w:tc>
-          <w:tcPr>
-            <w:tcW w:type="dxa" w:w="2400"/>
-            <w:tcBorders>
-              <w:top w:val="single" w:color="C9D6CF" w:sz="4"/>
-              <w:left w:val="none" w:color="FFFFFF" w:sz="0"/>
-              <w:bottom w:val="single" w:color="C9D6CF" w:sz="4"/>
-              <w:right w:val="none" w:color="FFFFFF" w:sz="0"/>
-            </w:tcBorders>
-            <w:tcMar>
-              <w:top w:type="dxa" w:w="70"/>
-              <w:left w:type="dxa" w:w="100"/>
-              <w:bottom w:type="dxa" w:w="70"/>
-              <w:right w:type="dxa" w:w="100"/>
-            </w:tcMar>
-          </w:tcPr>
-          <w:p>
-            <w:pPr>
-              <w:spacing w:after="0" w:line="260"/>
-            </w:pPr>
-            <w:r>
-              <w:rPr>
-                <w:rFonts w:ascii="Calibri" w:cs="Calibri" w:eastAsia="Calibri" w:hAnsi="Calibri"/>
-                <w:b w:val="false"/>
-                <w:bCs w:val="false"/>
-                <w:color w:val="000000"/>
-                <w:sz w:val="20"/>
-                <w:szCs w:val="20"/>
-              </w:rPr>
               <w:t xml:space="preserve">Synthetic data</w:t>
             </w:r>
           </w:p>
@@ -4241,6 +4152,743 @@
       <w:pPr>
         <w:spacing w:after="120"/>
       </w:pPr>
+    </w:p>
+    <w:p>
+      <w:pPr>
+        <w:pStyle w:val="Heading2"/>
+        <w:keepNext/>
+        <w:spacing w:after="100" w:before="260"/>
+      </w:pPr>
+      <w:r>
+        <w:rPr>
+          <w:rFonts w:ascii="Cambria" w:cs="Cambria" w:eastAsia="Cambria" w:hAnsi="Cambria"/>
+          <w:b/>
+          <w:bCs/>
+          <w:color w:val="1F4E3D"/>
+          <w:sz w:val="26"/>
+          <w:szCs w:val="26"/>
+        </w:rPr>
+        <w:t xml:space="preserve">12. References (Westminster Harvard)</w:t>
+      </w:r>
+    </w:p>
+    <w:p>
+      <w:pPr>
+        <w:spacing w:after="140" w:line="300"/>
+      </w:pPr>
+      <w:r>
+        <w:rPr>
+          <w:rFonts w:ascii="Calibri" w:cs="Calibri" w:eastAsia="Calibri" w:hAnsi="Calibri"/>
+          <w:i/>
+          <w:iCs/>
+          <w:sz w:val="22"/>
+          <w:szCs w:val="22"/>
+        </w:rPr>
+        <w:t xml:space="preserve">Author–date citations in the text refer to this list; sources are listed alphabetically by author or organisation.</w:t>
+      </w:r>
+    </w:p>
+    <w:p>
+      <w:pPr>
+        <w:spacing w:after="100" w:line="276"/>
+        <w:ind w:left="400" w:hanging="400"/>
+      </w:pPr>
+      <w:r>
+        <w:rPr>
+          <w:rFonts w:ascii="Calibri" w:cs="Calibri" w:eastAsia="Calibri" w:hAnsi="Calibri"/>
+          <w:sz w:val="22"/>
+          <w:szCs w:val="22"/>
+        </w:rPr>
+        <w:t xml:space="preserve">Agency of Statistics under the President of the Republic of Uzbekistan (2026). </w:t>
+      </w:r>
+      <w:r>
+        <w:rPr>
+          <w:rFonts w:ascii="Calibri" w:cs="Calibri" w:eastAsia="Calibri" w:hAnsi="Calibri"/>
+          <w:i/>
+          <w:iCs/>
+          <w:sz w:val="22"/>
+          <w:szCs w:val="22"/>
+        </w:rPr>
+        <w:t xml:space="preserve">Average monthly nominal wages: official statistics.</w:t>
+      </w:r>
+      <w:r>
+        <w:rPr>
+          <w:rFonts w:ascii="Calibri" w:cs="Calibri" w:eastAsia="Calibri" w:hAnsi="Calibri"/>
+          <w:sz w:val="22"/>
+          <w:szCs w:val="22"/>
+        </w:rPr>
+        <w:t xml:space="preserve"> Tashkent: Agency of Statistics. Available from https://stat.uz/en/ [Accessed 10 October 2026].</w:t>
+      </w:r>
+    </w:p>
+    <w:p>
+      <w:pPr>
+        <w:spacing w:after="100" w:line="276"/>
+        <w:ind w:left="400" w:hanging="400"/>
+      </w:pPr>
+      <w:r>
+        <w:rPr>
+          <w:rFonts w:ascii="Calibri" w:cs="Calibri" w:eastAsia="Calibri" w:hAnsi="Calibri"/>
+          <w:sz w:val="22"/>
+          <w:szCs w:val="22"/>
+        </w:rPr>
+        <w:t xml:space="preserve">Berka, P. and Sochorová, M. (1999). Guide to the financial data set. In: </w:t>
+      </w:r>
+      <w:r>
+        <w:rPr>
+          <w:rFonts w:ascii="Calibri" w:cs="Calibri" w:eastAsia="Calibri" w:hAnsi="Calibri"/>
+          <w:i/>
+          <w:iCs/>
+          <w:sz w:val="22"/>
+          <w:szCs w:val="22"/>
+        </w:rPr>
+        <w:t xml:space="preserve">PKDD'99 Discovery Challenge: workshop notes.</w:t>
+      </w:r>
+      <w:r>
+        <w:rPr>
+          <w:rFonts w:ascii="Calibri" w:cs="Calibri" w:eastAsia="Calibri" w:hAnsi="Calibri"/>
+          <w:sz w:val="22"/>
+          <w:szCs w:val="22"/>
+        </w:rPr>
+        <w:t xml:space="preserve"> Prague: University of Economics. Available from https://sorry.vse.cz/~berka/challenge/pkdd1999/berka.htm [Accessed 10 October 2026].</w:t>
+      </w:r>
+    </w:p>
+    <w:p>
+      <w:pPr>
+        <w:spacing w:after="100" w:line="276"/>
+        <w:ind w:left="400" w:hanging="400"/>
+      </w:pPr>
+      <w:r>
+        <w:rPr>
+          <w:rFonts w:ascii="Calibri" w:cs="Calibri" w:eastAsia="Calibri" w:hAnsi="Calibri"/>
+          <w:sz w:val="22"/>
+          <w:szCs w:val="22"/>
+        </w:rPr>
+        <w:t xml:space="preserve">Bradski, G. (2000). The OpenCV library. </w:t>
+      </w:r>
+      <w:r>
+        <w:rPr>
+          <w:rFonts w:ascii="Calibri" w:cs="Calibri" w:eastAsia="Calibri" w:hAnsi="Calibri"/>
+          <w:i/>
+          <w:iCs/>
+          <w:sz w:val="22"/>
+          <w:szCs w:val="22"/>
+        </w:rPr>
+        <w:t xml:space="preserve">Dr. Dobb's Journal of Software Tools,</w:t>
+      </w:r>
+      <w:r>
+        <w:rPr>
+          <w:rFonts w:ascii="Calibri" w:cs="Calibri" w:eastAsia="Calibri" w:hAnsi="Calibri"/>
+          <w:sz w:val="22"/>
+          <w:szCs w:val="22"/>
+        </w:rPr>
+        <w:t xml:space="preserve"> 25 (11), 120-125.</w:t>
+      </w:r>
+    </w:p>
+    <w:p>
+      <w:pPr>
+        <w:spacing w:after="100" w:line="276"/>
+        <w:ind w:left="400" w:hanging="400"/>
+      </w:pPr>
+      <w:r>
+        <w:rPr>
+          <w:rFonts w:ascii="Calibri" w:cs="Calibri" w:eastAsia="Calibri" w:hAnsi="Calibri"/>
+          <w:sz w:val="22"/>
+          <w:szCs w:val="22"/>
+        </w:rPr>
+        <w:t xml:space="preserve">Central Bank of the Republic of Uzbekistan (2019). </w:t>
+      </w:r>
+      <w:r>
+        <w:rPr>
+          <w:rFonts w:ascii="Calibri" w:cs="Calibri" w:eastAsia="Calibri" w:hAnsi="Calibri"/>
+          <w:i/>
+          <w:iCs/>
+          <w:sz w:val="22"/>
+          <w:szCs w:val="22"/>
+        </w:rPr>
+        <w:t xml:space="preserve">Микромолия ташкилоти ва ломбард томонидан бериладиган кредитлар (микроқарзлар) бўйича қарз олувчи жисмоний шахсларнинг қарз юкини тартибга солиш тўғрисидаги низомни тасдиқлаш ҳақида [On approval of the Regulation on regulating the debt burden of individuals borrowing from microfinance organisations and pawnshops].</w:t>
+      </w:r>
+      <w:r>
+        <w:rPr>
+          <w:rFonts w:ascii="Calibri" w:cs="Calibri" w:eastAsia="Calibri" w:hAnsi="Calibri"/>
+          <w:sz w:val="22"/>
+          <w:szCs w:val="22"/>
+        </w:rPr>
+        <w:t xml:space="preserve"> Board decision No. 24/5 of 28 September 2019, registration No. 3205 of 19 December 2019, as amended to 24 July 2025. Tashkent: National Database of Legislation of the Republic of Uzbekistan. Available from https://lex.uz/docs/4654149 [Accessed 11 October 2026].</w:t>
+      </w:r>
+    </w:p>
+    <w:p>
+      <w:pPr>
+        <w:spacing w:after="100" w:line="276"/>
+        <w:ind w:left="400" w:hanging="400"/>
+      </w:pPr>
+      <w:r>
+        <w:rPr>
+          <w:rFonts w:ascii="Calibri" w:cs="Calibri" w:eastAsia="Calibri" w:hAnsi="Calibri"/>
+          <w:sz w:val="22"/>
+          <w:szCs w:val="22"/>
+        </w:rPr>
+        <w:t xml:space="preserve">Central Bank of the Republic of Uzbekistan (2025). </w:t>
+      </w:r>
+      <w:r>
+        <w:rPr>
+          <w:rFonts w:ascii="Calibri" w:cs="Calibri" w:eastAsia="Calibri" w:hAnsi="Calibri"/>
+          <w:i/>
+          <w:iCs/>
+          <w:sz w:val="22"/>
+          <w:szCs w:val="22"/>
+        </w:rPr>
+        <w:t xml:space="preserve">Банкларга ўрнатиладиган макропруденциал нормативлар ҳамда улар томонидан бериладиган кредитлар (микроқарзлар) бўйича тўловларнинг энг юқори қийматларига доир талаблар тўғрисидаги низомни тасдиқлаш ҳақида [On approval of the Regulation on macroprudential norms set for banks and on the maximum values of payments on loans (microloans) issued by them].</w:t>
+      </w:r>
+      <w:r>
+        <w:rPr>
+          <w:rFonts w:ascii="Calibri" w:cs="Calibri" w:eastAsia="Calibri" w:hAnsi="Calibri"/>
+          <w:sz w:val="22"/>
+          <w:szCs w:val="22"/>
+        </w:rPr>
+        <w:t xml:space="preserve"> Board decision No. 7/3 of 8 April 2025, registration No. 3618 of 22 April 2025, as amended by Board decision No. 31/9 of 5 December 2025. Tashkent: National Database of Legislation of the Republic of Uzbekistan. Available from https://lex.uz/uz/docs/7491592 [Accessed 11 October 2026].</w:t>
+      </w:r>
+    </w:p>
+    <w:p>
+      <w:pPr>
+        <w:spacing w:after="100" w:line="276"/>
+        <w:ind w:left="400" w:hanging="400"/>
+      </w:pPr>
+      <w:r>
+        <w:rPr>
+          <w:rFonts w:ascii="Calibri" w:cs="Calibri" w:eastAsia="Calibri" w:hAnsi="Calibri"/>
+          <w:sz w:val="22"/>
+          <w:szCs w:val="22"/>
+        </w:rPr>
+        <w:t xml:space="preserve">Chen, T. and Guestrin, C. (2016). XGBoost: a scalable tree boosting system. In: </w:t>
+      </w:r>
+      <w:r>
+        <w:rPr>
+          <w:rFonts w:ascii="Calibri" w:cs="Calibri" w:eastAsia="Calibri" w:hAnsi="Calibri"/>
+          <w:i/>
+          <w:iCs/>
+          <w:sz w:val="22"/>
+          <w:szCs w:val="22"/>
+        </w:rPr>
+        <w:t xml:space="preserve">Proceedings of the 22nd ACM SIGKDD International Conference on Knowledge Discovery and Data Mining (KDD '16).</w:t>
+      </w:r>
+      <w:r>
+        <w:rPr>
+          <w:rFonts w:ascii="Calibri" w:cs="Calibri" w:eastAsia="Calibri" w:hAnsi="Calibri"/>
+          <w:sz w:val="22"/>
+          <w:szCs w:val="22"/>
+        </w:rPr>
+        <w:t xml:space="preserve"> New York: ACM, 785-794. Available from https://doi.org/10.1145/2939672.2939785 [Accessed 10 October 2026].</w:t>
+      </w:r>
+    </w:p>
+    <w:p>
+      <w:pPr>
+        <w:spacing w:after="100" w:line="276"/>
+        <w:ind w:left="400" w:hanging="400"/>
+      </w:pPr>
+      <w:r>
+        <w:rPr>
+          <w:rFonts w:ascii="Calibri" w:cs="Calibri" w:eastAsia="Calibri" w:hAnsi="Calibri"/>
+          <w:sz w:val="22"/>
+          <w:szCs w:val="22"/>
+        </w:rPr>
+        <w:t xml:space="preserve">e965 (2024). </w:t>
+      </w:r>
+      <w:r>
+        <w:rPr>
+          <w:rFonts w:ascii="Calibri" w:cs="Calibri" w:eastAsia="Calibri" w:hAnsi="Calibri"/>
+          <w:i/>
+          <w:iCs/>
+          <w:sz w:val="22"/>
+          <w:szCs w:val="22"/>
+        </w:rPr>
+        <w:t xml:space="preserve">sheetjs-npm-publisher: automated npm releases of SheetJS Community Edition (Version 0.20.3) [Computer program].</w:t>
+      </w:r>
+      <w:r>
+        <w:rPr>
+          <w:rFonts w:ascii="Calibri" w:cs="Calibri" w:eastAsia="Calibri" w:hAnsi="Calibri"/>
+          <w:sz w:val="22"/>
+          <w:szCs w:val="22"/>
+        </w:rPr>
+        <w:t xml:space="preserve"> Available from https://github.com/e965/sheetjs-npm-publisher [Accessed 10 October 2026].</w:t>
+      </w:r>
+    </w:p>
+    <w:p>
+      <w:pPr>
+        <w:spacing w:after="100" w:line="276"/>
+        <w:ind w:left="400" w:hanging="400"/>
+      </w:pPr>
+      <w:r>
+        <w:rPr>
+          <w:rFonts w:ascii="Calibri" w:cs="Calibri" w:eastAsia="Calibri" w:hAnsi="Calibri"/>
+          <w:sz w:val="22"/>
+          <w:szCs w:val="22"/>
+        </w:rPr>
+        <w:t xml:space="preserve">Harris, C.R. et al. (2020). Array programming with NumPy. </w:t>
+      </w:r>
+      <w:r>
+        <w:rPr>
+          <w:rFonts w:ascii="Calibri" w:cs="Calibri" w:eastAsia="Calibri" w:hAnsi="Calibri"/>
+          <w:i/>
+          <w:iCs/>
+          <w:sz w:val="22"/>
+          <w:szCs w:val="22"/>
+        </w:rPr>
+        <w:t xml:space="preserve">Nature,</w:t>
+      </w:r>
+      <w:r>
+        <w:rPr>
+          <w:rFonts w:ascii="Calibri" w:cs="Calibri" w:eastAsia="Calibri" w:hAnsi="Calibri"/>
+          <w:sz w:val="22"/>
+          <w:szCs w:val="22"/>
+        </w:rPr>
+        <w:t xml:space="preserve"> 585 (7825), 357-362. Available from https://doi.org/10.1038/s41586-020-2649-2 [Accessed 10 October 2026].</w:t>
+      </w:r>
+    </w:p>
+    <w:p>
+      <w:pPr>
+        <w:spacing w:after="100" w:line="276"/>
+        <w:ind w:left="400" w:hanging="400"/>
+      </w:pPr>
+      <w:r>
+        <w:rPr>
+          <w:rFonts w:ascii="Calibri" w:cs="Calibri" w:eastAsia="Calibri" w:hAnsi="Calibri"/>
+          <w:sz w:val="22"/>
+          <w:szCs w:val="22"/>
+        </w:rPr>
+        <w:t xml:space="preserve">Lacko, J. (no date). </w:t>
+      </w:r>
+      <w:r>
+        <w:rPr>
+          <w:rFonts w:ascii="Calibri" w:cs="Calibri" w:eastAsia="Calibri" w:hAnsi="Calibri"/>
+          <w:i/>
+          <w:iCs/>
+          <w:sz w:val="22"/>
+          <w:szCs w:val="22"/>
+        </w:rPr>
+        <w:t xml:space="preserve">berka-dataset: mirror of the PKDD'99 financial data set [Dataset].</w:t>
+      </w:r>
+      <w:r>
+        <w:rPr>
+          <w:rFonts w:ascii="Calibri" w:cs="Calibri" w:eastAsia="Calibri" w:hAnsi="Calibri"/>
+          <w:sz w:val="22"/>
+          <w:szCs w:val="22"/>
+        </w:rPr>
+        <w:t xml:space="preserve"> Available from https://github.com/jlacko/berka-dataset [Accessed 10 October 2026].</w:t>
+      </w:r>
+    </w:p>
+    <w:p>
+      <w:pPr>
+        <w:spacing w:after="100" w:line="276"/>
+        <w:ind w:left="400" w:hanging="400"/>
+      </w:pPr>
+      <w:r>
+        <w:rPr>
+          <w:rFonts w:ascii="Calibri" w:cs="Calibri" w:eastAsia="Calibri" w:hAnsi="Calibri"/>
+          <w:sz w:val="22"/>
+          <w:szCs w:val="22"/>
+        </w:rPr>
+        <w:t xml:space="preserve">McKinney, W. (2010). Data structures for statistical computing in Python. In: van der Walt, S. and Millman, J. (eds.) </w:t>
+      </w:r>
+      <w:r>
+        <w:rPr>
+          <w:rFonts w:ascii="Calibri" w:cs="Calibri" w:eastAsia="Calibri" w:hAnsi="Calibri"/>
+          <w:i/>
+          <w:iCs/>
+          <w:sz w:val="22"/>
+          <w:szCs w:val="22"/>
+        </w:rPr>
+        <w:t xml:space="preserve">Proceedings of the 9th Python in Science Conference.</w:t>
+      </w:r>
+      <w:r>
+        <w:rPr>
+          <w:rFonts w:ascii="Calibri" w:cs="Calibri" w:eastAsia="Calibri" w:hAnsi="Calibri"/>
+          <w:sz w:val="22"/>
+          <w:szCs w:val="22"/>
+        </w:rPr>
+        <w:t xml:space="preserve"> Austin, TX: SciPy, 56-61.</w:t>
+      </w:r>
+    </w:p>
+    <w:p>
+      <w:pPr>
+        <w:spacing w:after="100" w:line="276"/>
+        <w:ind w:left="400" w:hanging="400"/>
+      </w:pPr>
+      <w:r>
+        <w:rPr>
+          <w:rFonts w:ascii="Calibri" w:cs="Calibri" w:eastAsia="Calibri" w:hAnsi="Calibri"/>
+          <w:sz w:val="22"/>
+          <w:szCs w:val="22"/>
+        </w:rPr>
+        <w:t xml:space="preserve">Meta Platforms (2026). </w:t>
+      </w:r>
+      <w:r>
+        <w:rPr>
+          <w:rFonts w:ascii="Calibri" w:cs="Calibri" w:eastAsia="Calibri" w:hAnsi="Calibri"/>
+          <w:i/>
+          <w:iCs/>
+          <w:sz w:val="22"/>
+          <w:szCs w:val="22"/>
+        </w:rPr>
+        <w:t xml:space="preserve">React (Version 19) [Computer program].</w:t>
+      </w:r>
+      <w:r>
+        <w:rPr>
+          <w:rFonts w:ascii="Calibri" w:cs="Calibri" w:eastAsia="Calibri" w:hAnsi="Calibri"/>
+          <w:sz w:val="22"/>
+          <w:szCs w:val="22"/>
+        </w:rPr>
+        <w:t xml:space="preserve"> Available from https://react.dev [Accessed 10 October 2026].</w:t>
+      </w:r>
+    </w:p>
+    <w:p>
+      <w:pPr>
+        <w:spacing w:after="100" w:line="276"/>
+        <w:ind w:left="400" w:hanging="400"/>
+      </w:pPr>
+      <w:r>
+        <w:rPr>
+          <w:rFonts w:ascii="Calibri" w:cs="Calibri" w:eastAsia="Calibri" w:hAnsi="Calibri"/>
+          <w:sz w:val="22"/>
+          <w:szCs w:val="22"/>
+        </w:rPr>
+        <w:t xml:space="preserve">Microsoft (2026). </w:t>
+      </w:r>
+      <w:r>
+        <w:rPr>
+          <w:rFonts w:ascii="Calibri" w:cs="Calibri" w:eastAsia="Calibri" w:hAnsi="Calibri"/>
+          <w:i/>
+          <w:iCs/>
+          <w:sz w:val="22"/>
+          <w:szCs w:val="22"/>
+        </w:rPr>
+        <w:t xml:space="preserve">Playwright [Computer program].</w:t>
+      </w:r>
+      <w:r>
+        <w:rPr>
+          <w:rFonts w:ascii="Calibri" w:cs="Calibri" w:eastAsia="Calibri" w:hAnsi="Calibri"/>
+          <w:sz w:val="22"/>
+          <w:szCs w:val="22"/>
+        </w:rPr>
+        <w:t xml:space="preserve"> Available from https://playwright.dev [Accessed 10 October 2026].</w:t>
+      </w:r>
+    </w:p>
+    <w:p>
+      <w:pPr>
+        <w:spacing w:after="100" w:line="276"/>
+        <w:ind w:left="400" w:hanging="400"/>
+      </w:pPr>
+      <w:r>
+        <w:rPr>
+          <w:rFonts w:ascii="Calibri" w:cs="Calibri" w:eastAsia="Calibri" w:hAnsi="Calibri"/>
+          <w:sz w:val="22"/>
+          <w:szCs w:val="22"/>
+        </w:rPr>
+        <w:t xml:space="preserve">Mikrokreditbank (2026). </w:t>
+      </w:r>
+      <w:r>
+        <w:rPr>
+          <w:rFonts w:ascii="Calibri" w:cs="Calibri" w:eastAsia="Calibri" w:hAnsi="Calibri"/>
+          <w:i/>
+          <w:iCs/>
+          <w:sz w:val="22"/>
+          <w:szCs w:val="22"/>
+        </w:rPr>
+        <w:t xml:space="preserve">Credit products: Ommabop 2, Express, Business Online 2 and family-entrepreneurship programmes.</w:t>
+      </w:r>
+      <w:r>
+        <w:rPr>
+          <w:rFonts w:ascii="Calibri" w:cs="Calibri" w:eastAsia="Calibri" w:hAnsi="Calibri"/>
+          <w:sz w:val="22"/>
+          <w:szCs w:val="22"/>
+        </w:rPr>
+        <w:t xml:space="preserve"> Available from https://mkbank.uz [Accessed 10 October 2026].</w:t>
+      </w:r>
+    </w:p>
+    <w:p>
+      <w:pPr>
+        <w:spacing w:after="100" w:line="276"/>
+        <w:ind w:left="400" w:hanging="400"/>
+      </w:pPr>
+      <w:r>
+        <w:rPr>
+          <w:rFonts w:ascii="Calibri" w:cs="Calibri" w:eastAsia="Calibri" w:hAnsi="Calibri"/>
+          <w:sz w:val="22"/>
+          <w:szCs w:val="22"/>
+        </w:rPr>
+        <w:t xml:space="preserve">Mozilla (2025). </w:t>
+      </w:r>
+      <w:r>
+        <w:rPr>
+          <w:rFonts w:ascii="Calibri" w:cs="Calibri" w:eastAsia="Calibri" w:hAnsi="Calibri"/>
+          <w:i/>
+          <w:iCs/>
+          <w:sz w:val="22"/>
+          <w:szCs w:val="22"/>
+        </w:rPr>
+        <w:t xml:space="preserve">PDF.js (pdfjs-dist Version 4.10) [Computer program].</w:t>
+      </w:r>
+      <w:r>
+        <w:rPr>
+          <w:rFonts w:ascii="Calibri" w:cs="Calibri" w:eastAsia="Calibri" w:hAnsi="Calibri"/>
+          <w:sz w:val="22"/>
+          <w:szCs w:val="22"/>
+        </w:rPr>
+        <w:t xml:space="preserve"> Available from https://github.com/mozilla/pdf.js [Accessed 10 October 2026].</w:t>
+      </w:r>
+    </w:p>
+    <w:p>
+      <w:pPr>
+        <w:spacing w:after="100" w:line="276"/>
+        <w:ind w:left="400" w:hanging="400"/>
+      </w:pPr>
+      <w:r>
+        <w:rPr>
+          <w:rFonts w:ascii="Calibri" w:cs="Calibri" w:eastAsia="Calibri" w:hAnsi="Calibri"/>
+          <w:sz w:val="22"/>
+          <w:szCs w:val="22"/>
+        </w:rPr>
+        <w:t xml:space="preserve">Pedregosa, F. et al. (2011). Scikit-learn: machine learning in Python. </w:t>
+      </w:r>
+      <w:r>
+        <w:rPr>
+          <w:rFonts w:ascii="Calibri" w:cs="Calibri" w:eastAsia="Calibri" w:hAnsi="Calibri"/>
+          <w:i/>
+          <w:iCs/>
+          <w:sz w:val="22"/>
+          <w:szCs w:val="22"/>
+        </w:rPr>
+        <w:t xml:space="preserve">Journal of Machine Learning Research,</w:t>
+      </w:r>
+      <w:r>
+        <w:rPr>
+          <w:rFonts w:ascii="Calibri" w:cs="Calibri" w:eastAsia="Calibri" w:hAnsi="Calibri"/>
+          <w:sz w:val="22"/>
+          <w:szCs w:val="22"/>
+        </w:rPr>
+        <w:t xml:space="preserve"> 12, 2825-2830.</w:t>
+      </w:r>
+    </w:p>
+    <w:p>
+      <w:pPr>
+        <w:spacing w:after="100" w:line="276"/>
+        <w:ind w:left="400" w:hanging="400"/>
+      </w:pPr>
+      <w:r>
+        <w:rPr>
+          <w:rFonts w:ascii="Calibri" w:cs="Calibri" w:eastAsia="Calibri" w:hAnsi="Calibri"/>
+          <w:sz w:val="22"/>
+          <w:szCs w:val="22"/>
+        </w:rPr>
+        <w:t xml:space="preserve">SheetJS LLC (2024). </w:t>
+      </w:r>
+      <w:r>
+        <w:rPr>
+          <w:rFonts w:ascii="Calibri" w:cs="Calibri" w:eastAsia="Calibri" w:hAnsi="Calibri"/>
+          <w:i/>
+          <w:iCs/>
+          <w:sz w:val="22"/>
+          <w:szCs w:val="22"/>
+        </w:rPr>
+        <w:t xml:space="preserve">SheetJS Community Edition (Version 0.20.3) [Computer program].</w:t>
+      </w:r>
+      <w:r>
+        <w:rPr>
+          <w:rFonts w:ascii="Calibri" w:cs="Calibri" w:eastAsia="Calibri" w:hAnsi="Calibri"/>
+          <w:sz w:val="22"/>
+          <w:szCs w:val="22"/>
+        </w:rPr>
+        <w:t xml:space="preserve"> Available from https://sheetjs.com [Accessed 10 October 2026].</w:t>
+      </w:r>
+    </w:p>
+    <w:p>
+      <w:pPr>
+        <w:spacing w:after="100" w:line="276"/>
+        <w:ind w:left="400" w:hanging="400"/>
+      </w:pPr>
+      <w:r>
+        <w:rPr>
+          <w:rFonts w:ascii="Calibri" w:cs="Calibri" w:eastAsia="Calibri" w:hAnsi="Calibri"/>
+          <w:sz w:val="22"/>
+          <w:szCs w:val="22"/>
+        </w:rPr>
+        <w:t xml:space="preserve">Smith, R. (2007). An overview of the Tesseract OCR engine. In: </w:t>
+      </w:r>
+      <w:r>
+        <w:rPr>
+          <w:rFonts w:ascii="Calibri" w:cs="Calibri" w:eastAsia="Calibri" w:hAnsi="Calibri"/>
+          <w:i/>
+          <w:iCs/>
+          <w:sz w:val="22"/>
+          <w:szCs w:val="22"/>
+        </w:rPr>
+        <w:t xml:space="preserve">Ninth International Conference on Document Analysis and Recognition (ICDAR 2007).</w:t>
+      </w:r>
+      <w:r>
+        <w:rPr>
+          <w:rFonts w:ascii="Calibri" w:cs="Calibri" w:eastAsia="Calibri" w:hAnsi="Calibri"/>
+          <w:sz w:val="22"/>
+          <w:szCs w:val="22"/>
+        </w:rPr>
+        <w:t xml:space="preserve"> Washington, DC: IEEE Computer Society, 629-633. Available from https://doi.org/10.1109/ICDAR.2007.4376991 [Accessed 10 October 2026].</w:t>
+      </w:r>
+    </w:p>
+    <w:p>
+      <w:pPr>
+        <w:spacing w:after="100" w:line="276"/>
+        <w:ind w:left="400" w:hanging="400"/>
+      </w:pPr>
+      <w:r>
+        <w:rPr>
+          <w:rFonts w:ascii="Calibri" w:cs="Calibri" w:eastAsia="Calibri" w:hAnsi="Calibri"/>
+          <w:sz w:val="22"/>
+          <w:szCs w:val="22"/>
+        </w:rPr>
+        <w:t xml:space="preserve">Spot (2026). </w:t>
+      </w:r>
+      <w:r>
+        <w:rPr>
+          <w:rFonts w:ascii="Calibri" w:cs="Calibri" w:eastAsia="Calibri" w:hAnsi="Calibri"/>
+          <w:i/>
+          <w:iCs/>
+          <w:sz w:val="22"/>
+          <w:szCs w:val="22"/>
+        </w:rPr>
+        <w:t xml:space="preserve">«Микрокредитбанк» выделит 7,4 трлн сумов малому и среднему бизнесу в 2026 году [Mikrokreditbank will allocate 7.4 trillion soums to small and medium business in 2026].</w:t>
+      </w:r>
+      <w:r>
+        <w:rPr>
+          <w:rFonts w:ascii="Calibri" w:cs="Calibri" w:eastAsia="Calibri" w:hAnsi="Calibri"/>
+          <w:sz w:val="22"/>
+          <w:szCs w:val="22"/>
+        </w:rPr>
+        <w:t xml:space="preserve"> Sponsored article, 27 March. Available from https://www.spot.uz/ru/2026/03/27/mk-bank/ [Accessed 10 October 2026].</w:t>
+      </w:r>
+    </w:p>
+    <w:p>
+      <w:pPr>
+        <w:spacing w:after="100" w:line="276"/>
+        <w:ind w:left="400" w:hanging="400"/>
+      </w:pPr>
+      <w:r>
+        <w:rPr>
+          <w:rFonts w:ascii="Calibri" w:cs="Calibri" w:eastAsia="Calibri" w:hAnsi="Calibri"/>
+          <w:sz w:val="22"/>
+          <w:szCs w:val="22"/>
+        </w:rPr>
+        <w:t xml:space="preserve">Tesseract OCR (no date). </w:t>
+      </w:r>
+      <w:r>
+        <w:rPr>
+          <w:rFonts w:ascii="Calibri" w:cs="Calibri" w:eastAsia="Calibri" w:hAnsi="Calibri"/>
+          <w:i/>
+          <w:iCs/>
+          <w:sz w:val="22"/>
+          <w:szCs w:val="22"/>
+        </w:rPr>
+        <w:t xml:space="preserve">tessdata_fast: fast integer versions of trained LSTM models (uzb, uzb_cyrl, rus, eng) [Data files].</w:t>
+      </w:r>
+      <w:r>
+        <w:rPr>
+          <w:rFonts w:ascii="Calibri" w:cs="Calibri" w:eastAsia="Calibri" w:hAnsi="Calibri"/>
+          <w:sz w:val="22"/>
+          <w:szCs w:val="22"/>
+        </w:rPr>
+        <w:t xml:space="preserve"> Available from https://github.com/tesseract-ocr/tessdata_fast [Accessed 10 October 2026].</w:t>
+      </w:r>
+    </w:p>
+    <w:p>
+      <w:pPr>
+        <w:spacing w:after="100" w:line="276"/>
+        <w:ind w:left="400" w:hanging="400"/>
+      </w:pPr>
+      <w:r>
+        <w:rPr>
+          <w:rFonts w:ascii="Calibri" w:cs="Calibri" w:eastAsia="Calibri" w:hAnsi="Calibri"/>
+          <w:sz w:val="22"/>
+          <w:szCs w:val="22"/>
+        </w:rPr>
+        <w:t xml:space="preserve">Tesseract.js contributors (2025). </w:t>
+      </w:r>
+      <w:r>
+        <w:rPr>
+          <w:rFonts w:ascii="Calibri" w:cs="Calibri" w:eastAsia="Calibri" w:hAnsi="Calibri"/>
+          <w:i/>
+          <w:iCs/>
+          <w:sz w:val="22"/>
+          <w:szCs w:val="22"/>
+        </w:rPr>
+        <w:t xml:space="preserve">Tesseract.js (Version 6) [Computer program].</w:t>
+      </w:r>
+      <w:r>
+        <w:rPr>
+          <w:rFonts w:ascii="Calibri" w:cs="Calibri" w:eastAsia="Calibri" w:hAnsi="Calibri"/>
+          <w:sz w:val="22"/>
+          <w:szCs w:val="22"/>
+        </w:rPr>
+        <w:t xml:space="preserve"> Available from https://github.com/naptha/tesseract.js [Accessed 10 October 2026].</w:t>
+      </w:r>
+    </w:p>
+    <w:p>
+      <w:pPr>
+        <w:spacing w:after="100" w:line="276"/>
+        <w:ind w:left="400" w:hanging="400"/>
+      </w:pPr>
+      <w:r>
+        <w:rPr>
+          <w:rFonts w:ascii="Calibri" w:cs="Calibri" w:eastAsia="Calibri" w:hAnsi="Calibri"/>
+          <w:sz w:val="22"/>
+          <w:szCs w:val="22"/>
+        </w:rPr>
+        <w:t xml:space="preserve">Vercel (2026). </w:t>
+      </w:r>
+      <w:r>
+        <w:rPr>
+          <w:rFonts w:ascii="Calibri" w:cs="Calibri" w:eastAsia="Calibri" w:hAnsi="Calibri"/>
+          <w:i/>
+          <w:iCs/>
+          <w:sz w:val="22"/>
+          <w:szCs w:val="22"/>
+        </w:rPr>
+        <w:t xml:space="preserve">Next.js (Version 16) [Computer program].</w:t>
+      </w:r>
+      <w:r>
+        <w:rPr>
+          <w:rFonts w:ascii="Calibri" w:cs="Calibri" w:eastAsia="Calibri" w:hAnsi="Calibri"/>
+          <w:sz w:val="22"/>
+          <w:szCs w:val="22"/>
+        </w:rPr>
+        <w:t xml:space="preserve"> Available from https://nextjs.org [Accessed 10 October 2026].</w:t>
+      </w:r>
+    </w:p>
+    <w:p>
+      <w:pPr>
+        <w:spacing w:after="100" w:line="276"/>
+        <w:ind w:left="400" w:hanging="400"/>
+      </w:pPr>
+      <w:r>
+        <w:rPr>
+          <w:rFonts w:ascii="Calibri" w:cs="Calibri" w:eastAsia="Calibri" w:hAnsi="Calibri"/>
+          <w:sz w:val="22"/>
+          <w:szCs w:val="22"/>
+        </w:rPr>
+        <w:t xml:space="preserve">Yuz.uz (2021). </w:t>
+      </w:r>
+      <w:r>
+        <w:rPr>
+          <w:rFonts w:ascii="Calibri" w:cs="Calibri" w:eastAsia="Calibri" w:hAnsi="Calibri"/>
+          <w:i/>
+          <w:iCs/>
+          <w:sz w:val="22"/>
+          <w:szCs w:val="22"/>
+        </w:rPr>
+        <w:t xml:space="preserve">Почти 800 тысяч граждан Узбекистана выбрали самозанятость [Nearly 800 thousand citizens of Uzbekistan chose self-employment].</w:t>
+      </w:r>
+      <w:r>
+        <w:rPr>
+          <w:rFonts w:ascii="Calibri" w:cs="Calibri" w:eastAsia="Calibri" w:hAnsi="Calibri"/>
+          <w:sz w:val="22"/>
+          <w:szCs w:val="22"/>
+        </w:rPr>
+        <w:t xml:space="preserve"> 6 May. Available from https://yuz.uz/ru/news/pochti-800-tsyach-grajdan-uzbekistana-vbrali-samozanyatost [Accessed 10 October 2026].</w:t>
+      </w:r>
     </w:p>
     <w:sectPr>
       <w:headerReference w:type="default" r:id="rId7"/>

</xml_diff>

<commit_message>
English only: debt-burden ratio abbreviated DBR everywhere (UI, memo, docs, deck); citation texts in English; deck appendices A-C removed (their content is on the About page and Model card), References slides kept
Co-Authored-By: Claude Fable 5.1 <noreply@anthropic.com>
Claude-Session: https://claude.ai/code/session_01Xf5A9DfRgzoaeNELy2iEQH
</commit_message>
<xml_diff>
--- a/docs/Daromad_project_explained.docx
+++ b/docs/Daromad_project_explained.docx
@@ -96,7 +96,7 @@
         </w:rPr>
         <w:t xml:space="preserve">Live prototype: </w:t>
       </w:r>
-      <w:hyperlink w:history="1" r:id="rIdw9yb0rlxogp18s-q5lpzp">
+      <w:hyperlink w:history="1" r:id="rIdwho-2hi1dw2y1oybbjggk">
         <w:r>
           <w:rPr>
             <w:rFonts w:ascii="Calibri" w:cs="Calibri" w:eastAsia="Calibri" w:hAnsi="Calibri"/>
@@ -123,7 +123,7 @@
         </w:rPr>
         <w:t xml:space="preserve">Source code: </w:t>
       </w:r>
-      <w:hyperlink w:history="1" r:id="rIdecqwassvuhhk7tfhnjrla">
+      <w:hyperlink w:history="1" r:id="rIdnpqdh2whaib3z5h8fqvxh">
         <w:r>
           <w:rPr>
             <w:rFonts w:ascii="Calibri" w:cs="Calibri" w:eastAsia="Calibri" w:hAnsi="Calibri"/>
@@ -266,7 +266,7 @@
           <w:sz w:val="22"/>
           <w:szCs w:val="22"/>
         </w:rPr>
-        <w:t xml:space="preserve">In Uzbekistan a large part of the economy is self-employed people and family businesses: a seamstress, a taxi driver, a small shop, a home bakery. They receive money on bank cards and wallets (Humo, Uzcard, Payme, Click, Uzum) but they have no employer, no salary certificate and, as self-employed, they do not file a tax return. When they ask a bank for a loan, the bank must by law calculate their income and their debt-burden ratio (ПДН) — but the only evidence the regulation accepts for them is the money credited to their bank accounts (Central Bank of the Republic of Uzbekistan, 2025, clause 18), in other words their statements.</w:t>
+        <w:t xml:space="preserve">In Uzbekistan a large part of the economy is self-employed people and family businesses: a seamstress, a taxi driver, a small shop, a home bakery. They receive money on bank cards and wallets (Humo, Uzcard, Payme, Click, Uzum) but they have no employer, no salary certificate and, as self-employed, they do not file a tax return. When they ask a bank for a loan, the bank must by law calculate their income and their debt-burden ratio (DBR) — but the only evidence the regulation accepts for them is the money credited to their bank accounts (Central Bank of the Republic of Uzbekistan, 2025, clause 18), in other words their statements.</w:t>
       </w:r>
     </w:p>
     <w:p>
@@ -746,7 +746,7 @@
           <w:sz w:val="22"/>
           <w:szCs w:val="22"/>
         </w:rPr>
-        <w:t xml:space="preserve">We tested it locally on genuine wallet exports (headers like "Дата и время", a payment-number column, +/− type column, no balance column) and on the common Russian bank layout with two date columns (operation date and posting date), document numbers and 20-digit account numbers. The parser was broadened: the first date column is always the transaction date, later date columns are never read as amounts, long digit-only identifiers are never amounts, and numeric columns are mapped to debit/credit/balance by the header column boundaries. A 25-page PDF of that layout is now a test fixture. The real files were used only on our own machine — nothing from them is in the repository, the samples or the deck.</w:t>
+        <w:t xml:space="preserve">We tested it locally on genuine wallet exports (a combined date-and-time column, a payment-number column, a +/− type column, no balance column) and on the common Russian bank layout with two date columns (operation date and posting date), document numbers and 20-digit account numbers. The parser was broadened: the first date column is always the transaction date, later date columns are never read as amounts, long digit-only identifiers are never amounts, and numeric columns are mapped to debit/credit/balance by the header column boundaries. A 25-page PDF of that layout is now a test fixture. The real files were used only on our own machine — nothing from them is in the repository, the samples or the deck.</w:t>
       </w:r>
     </w:p>
     <w:p>
@@ -960,7 +960,7 @@
           <w:sz w:val="22"/>
           <w:szCs w:val="22"/>
         </w:rPr>
-        <w:t xml:space="preserve">Debt-burden ratio (ПДН). </w:t>
+        <w:t xml:space="preserve">Debt-burden ratio (DBR). </w:t>
       </w:r>
       <w:r>
         <w:rPr>
@@ -1139,7 +1139,7 @@
           <w:sz w:val="22"/>
           <w:szCs w:val="22"/>
         </w:rPr>
-        <w:t xml:space="preserve">A PDF statement is opened with pdf.js (Mozilla, 2025), which gives us every word with its position on the page. We find the header row (date, description, debit, credit, balance in Russian, Uzbek or English), then cluster the numbers by their horizontal position so that each column is recognised even in a layout we have never seen. Excel and CSV files are read with SheetJS (SheetJS LLC, 2024); we find the header row by its words, understand many column conventions (separate debit/credit columns, one signed amount column, a type column that says "credit/debit", "kirim/chiqim", "приход/расход" or "+/−"), skip failed or cancelled payments, and ignore identifier columns such as payment numbers. Amounts are cleaned of spaces, non-breaking spaces, currency words and Unicode minus signs. Receipt photos go through Tesseract OCR (Smith, 2007) with Uzbek, Russian and English models hosted in our own site; we then pull out the total, the seller's INN, the date and the receipt number with pattern rules. The self-employed certificate is read for the name, INN, registration date and status.</w:t>
+        <w:t xml:space="preserve">A PDF statement is opened with pdf.js (Mozilla, 2025), which gives us every word with its position on the page. We find the header row (date, description, debit, credit, balance in Russian, Uzbek or English), then cluster the numbers by their horizontal position so that each column is recognised even in a layout we have never seen. Excel and CSV files are read with SheetJS (SheetJS LLC, 2024); we find the header row by its words, understand many column conventions (separate debit/credit columns, one signed amount column, a type column that says credit/debit, inflow/outflow (in Uzbek or Russian) or +/−), skip failed or cancelled payments, and ignore identifier columns such as payment numbers. Amounts are cleaned of spaces, non-breaking spaces, currency words and Unicode minus signs. Receipt photos go through Tesseract OCR (Smith, 2007) with Uzbek, Russian and English models hosted in our own site; we then pull out the total, the seller's INN, the date and the receipt number with pattern rules. The self-employed certificate is read for the name, INN, registration date and status.</w:t>
       </w:r>
     </w:p>
     <w:p>
@@ -1210,7 +1210,7 @@
           <w:sz w:val="22"/>
           <w:szCs w:val="22"/>
         </w:rPr>
-        <w:t xml:space="preserve">Step 4 — The rule engine (ПДН). </w:t>
+        <w:t xml:space="preserve">Step 4 — The rule engine (DBR). </w:t>
       </w:r>
     </w:p>
     <w:p>
@@ -1815,7 +1815,7 @@
                 <w:sz w:val="20"/>
                 <w:szCs w:val="20"/>
               </w:rPr>
-              <w:t xml:space="preserve">Statement layouts the parser had never seen (signed CSV, Kirim/Chiqim Excel, quoted English CSV with type column, Unicode minus, headerless CSV, Приход/Расход TSV, Payme-style wallet export, Russian bank export with two date columns)</w:t>
+              <w:t xml:space="preserve">Statement layouts the parser had never seen (signed CSV, Kirim/Chiqim Excel, quoted English CSV with type column, Unicode minus, headerless CSV, Russian inflow/outflow TSV, wallet export, Russian bank export with two date columns)</w:t>
             </w:r>
           </w:p>
         </w:tc>
@@ -2671,7 +2671,7 @@
           <w:sz w:val="22"/>
           <w:szCs w:val="22"/>
         </w:rPr>
-        <w:t xml:space="preserve">A three-month pilot in five branches with fifty mahalla agents costs about 190 million UZS: our three people plus one bank analyst, one small virtual machine, no GPU, no licences and no API spend. The value rests on two assumptions that the pilot exists to measure: document handling falls from about 90 to about 25 minutes per application, and about 30 % of MKBANK's 140,000 micro-project applications are addressable (those outside the ПДН-exempt family programme; a bank has no small-loan threshold). That gives 42,000 applications a year, about 45,000 officer-hours saved, the work of 23 full-time officers, roughly 4 billion UZS a year at a loaded monthly cost of 15 million per officer. The pilot alone does not pay for itself in five branches; the bank-wide roll-out repays it within its first month, and within two months even if only 10 % of applications are addressable. Every term of this calculation is a slider in the deck.</w:t>
+        <w:t xml:space="preserve">A three-month pilot in five branches with fifty mahalla agents costs about 190 million UZS: our three people plus one bank analyst, one small virtual machine, no GPU, no licences and no API spend. The value rests on two assumptions that the pilot exists to measure: document handling falls from about 90 to about 25 minutes per application, and about 30 % of MKBANK's 140,000 micro-project applications are addressable (those outside the DBR-exempt family programme; a bank has no small-loan threshold). That gives 42,000 applications a year, about 45,000 officer-hours saved, the work of 23 full-time officers, roughly 4 billion UZS a year at a loaded monthly cost of 15 million per officer. The pilot alone does not pay for itself in five branches; the bank-wide roll-out repays it within its first month, and within two months even if only 10 % of applications are addressable. Every term of this calculation is a slider in the deck.</w:t>
       </w:r>
     </w:p>
     <w:p>
@@ -2888,7 +2888,7 @@
         </w:rPr>
         <w:t xml:space="preserve">Live prototype: </w:t>
       </w:r>
-      <w:hyperlink w:history="1" r:id="rIducztmfcmt5kmjj06a8nom">
+      <w:hyperlink w:history="1" r:id="rIdutkg6nusk5ltrthta_unp">
         <w:r>
           <w:rPr>
             <w:rFonts w:ascii="Calibri" w:cs="Calibri" w:eastAsia="Calibri" w:hAnsi="Calibri"/>
@@ -2928,7 +2928,7 @@
         </w:rPr>
         <w:t xml:space="preserve">Repository: </w:t>
       </w:r>
-      <w:hyperlink w:history="1" r:id="rIdwfkr0othvqz_ett0ojavp">
+      <w:hyperlink w:history="1" r:id="rIdumggxizkt3jn1_qpp9q2b">
         <w:r>
           <w:rPr>
             <w:rFonts w:ascii="Calibri" w:cs="Calibri" w:eastAsia="Calibri" w:hAnsi="Calibri"/>
@@ -2968,7 +2968,7 @@
         </w:rPr>
         <w:t xml:space="preserve">Model card page: </w:t>
       </w:r>
-      <w:hyperlink w:history="1" r:id="rIdwgignqxw7rfovtlk67cow">
+      <w:hyperlink w:history="1" r:id="rId1gclvntizuzkrrrkv2dbl">
         <w:r>
           <w:rPr>
             <w:rFonts w:ascii="Calibri" w:cs="Calibri" w:eastAsia="Calibri" w:hAnsi="Calibri"/>
@@ -3186,7 +3186,7 @@
                 <w:sz w:val="20"/>
                 <w:szCs w:val="20"/>
               </w:rPr>
-              <w:t xml:space="preserve">ПДН (debt-burden ratio)</w:t>
+              <w:t xml:space="preserve">debt-burden ratio (DBR)</w:t>
             </w:r>
           </w:p>
         </w:tc>
@@ -3219,7 +3219,7 @@
                 <w:sz w:val="20"/>
                 <w:szCs w:val="20"/>
               </w:rPr>
-              <w:t xml:space="preserve">Monthly loan payments divided by monthly income. For bank loans the Central Bank limits it to 50 % (Regulation 3618, clause 3). Also called "қарз юки кўрсаткичи".</w:t>
+              <w:t xml:space="preserve">Monthly loan payments divided by monthly income. For bank loans the Central Bank limits it to 50 % (Regulation 3618, clause 3).</w:t>
             </w:r>
           </w:p>
         </w:tc>

</xml_diff>